<commit_message>
docs(Documentation): upgrade technical document generator with real participant data, 4 real charts, and dense 13-page content
</commit_message>
<xml_diff>
--- a/docs/Documentation/Desain_Sistem_Arsitektur_Genesis.docx
+++ b/docs/Documentation/Desain_Sistem_Arsitektur_Genesis.docx
@@ -4,7 +4,7 @@
   <w:body>
     <w:p>
       <w:pPr>
-        <w:spacing w:before="2400" w:after="240"/>
+        <w:spacing w:before="1000" w:after="240"/>
         <w:jc w:val="center"/>
       </w:pPr>
       <w:r>
@@ -19,7 +19,7 @@
     </w:p>
     <w:p>
       <w:pPr>
-        <w:spacing w:after="2800"/>
+        <w:spacing w:after="600"/>
         <w:jc w:val="center"/>
       </w:pPr>
       <w:r>
@@ -36,22 +36,813 @@
     </w:p>
     <w:p>
       <w:pPr>
-        <w:spacing w:after="200"/>
+        <w:spacing w:before="0" w:after="120" w:line="360" w:lineRule="auto"/>
+        <w:ind w:firstLine="0"/>
         <w:jc w:val="center"/>
       </w:pPr>
       <w:r>
         <w:rPr>
           <w:rFonts w:ascii="Times New Roman" w:hAnsi="Times New Roman"/>
           <w:b/>
+          <w:i w:val="0"/>
+          <w:color w:val="000000"/>
           <w:sz w:val="24"/>
+        </w:rPr>
+        <w:t>Daftar Identitas Tim Pengembang Proyek:</w:t>
+      </w:r>
+    </w:p>
+    <w:tbl>
+      <w:tblPr>
+        <w:tblW w:type="auto" w:w="0"/>
+        <w:jc w:val="center"/>
+        <w:tblLayout w:type="fixed"/>
+        <w:tblLook w:firstColumn="1" w:firstRow="1" w:lastColumn="0" w:lastRow="0" w:noHBand="0" w:noVBand="1" w:val="04A0"/>
+      </w:tblPr>
+      <w:tblGrid>
+        <w:gridCol w:w="1984"/>
+        <w:gridCol w:w="1984"/>
+        <w:gridCol w:w="1984"/>
+        <w:gridCol w:w="1984"/>
+      </w:tblGrid>
+      <w:tr>
+        <w:tc>
+          <w:tcPr>
+            <w:tcW w:type="dxa" w:w="1701"/>
+            <w:tcMar>
+              <w:top w:w="60" w:type="dxa"/>
+              <w:bottom w:w="60" w:type="dxa"/>
+              <w:left w:w="100" w:type="dxa"/>
+              <w:right w:w="100" w:type="dxa"/>
+            </w:tcMar>
+            <w:shd w:fill="F2F2F2"/>
+            <w:tcBorders>
+              <w:top w:val="single" w:sz="4" w:space="0" w:color="CCCCCC"/>
+              <w:bottom w:val="single" w:sz="4" w:space="0" w:color="CCCCCC"/>
+              <w:left w:val="single" w:sz="4" w:space="0" w:color="CCCCCC"/>
+              <w:right w:val="single" w:sz="4" w:space="0" w:color="CCCCCC"/>
+            </w:tcBorders>
+            <w:vAlign w:val="center"/>
+          </w:tcPr>
+          <w:p>
+            <w:pPr>
+              <w:spacing w:before="0" w:after="0" w:line="276" w:lineRule="auto"/>
+              <w:jc w:val="center"/>
+            </w:pPr>
+            <w:r/>
+            <w:r>
+              <w:rPr>
+                <w:rFonts w:ascii="Times New Roman" w:hAnsi="Times New Roman"/>
+                <w:b/>
+                <w:i w:val="0"/>
+                <w:color w:val="000000"/>
+                <w:sz w:val="20"/>
+              </w:rPr>
+              <w:t xml:space="preserve">NISN </w:t>
+            </w:r>
+            <w:r>
+              <w:rPr>
+                <w:rFonts w:ascii="Times New Roman" w:hAnsi="Times New Roman"/>
+                <w:b/>
+                <w:i w:val="0"/>
+                <w:color w:val="000000"/>
+                <w:sz w:val="20"/>
+              </w:rPr>
+              <w:t xml:space="preserve">/ </w:t>
+            </w:r>
+            <w:r>
+              <w:rPr>
+                <w:rFonts w:ascii="Times New Roman" w:hAnsi="Times New Roman"/>
+                <w:b/>
+                <w:i w:val="0"/>
+                <w:color w:val="000000"/>
+                <w:sz w:val="20"/>
+              </w:rPr>
+              <w:t xml:space="preserve">NIM </w:t>
+            </w:r>
+          </w:p>
+        </w:tc>
+        <w:tc>
+          <w:tcPr>
+            <w:tcW w:type="dxa" w:w="2268"/>
+            <w:tcMar>
+              <w:top w:w="60" w:type="dxa"/>
+              <w:bottom w:w="60" w:type="dxa"/>
+              <w:left w:w="100" w:type="dxa"/>
+              <w:right w:w="100" w:type="dxa"/>
+            </w:tcMar>
+            <w:shd w:fill="F2F2F2"/>
+            <w:tcBorders>
+              <w:top w:val="single" w:sz="4" w:space="0" w:color="CCCCCC"/>
+              <w:bottom w:val="single" w:sz="4" w:space="0" w:color="CCCCCC"/>
+              <w:left w:val="single" w:sz="4" w:space="0" w:color="CCCCCC"/>
+              <w:right w:val="single" w:sz="4" w:space="0" w:color="CCCCCC"/>
+            </w:tcBorders>
+            <w:vAlign w:val="center"/>
+          </w:tcPr>
+          <w:p>
+            <w:pPr>
+              <w:spacing w:before="0" w:after="0" w:line="276" w:lineRule="auto"/>
+              <w:jc w:val="center"/>
+            </w:pPr>
+            <w:r/>
+            <w:r>
+              <w:rPr>
+                <w:rFonts w:ascii="Times New Roman" w:hAnsi="Times New Roman"/>
+                <w:b/>
+                <w:i w:val="0"/>
+                <w:color w:val="000000"/>
+                <w:sz w:val="20"/>
+              </w:rPr>
+              <w:t xml:space="preserve">Nama </w:t>
+            </w:r>
+            <w:r>
+              <w:rPr>
+                <w:rFonts w:ascii="Times New Roman" w:hAnsi="Times New Roman"/>
+                <w:b/>
+                <w:i w:val="0"/>
+                <w:color w:val="000000"/>
+                <w:sz w:val="20"/>
+              </w:rPr>
+              <w:t xml:space="preserve">Lengkap </w:t>
+            </w:r>
+          </w:p>
+        </w:tc>
+        <w:tc>
+          <w:tcPr>
+            <w:tcW w:type="dxa" w:w="2551"/>
+            <w:tcMar>
+              <w:top w:w="60" w:type="dxa"/>
+              <w:bottom w:w="60" w:type="dxa"/>
+              <w:left w:w="100" w:type="dxa"/>
+              <w:right w:w="100" w:type="dxa"/>
+            </w:tcMar>
+            <w:shd w:fill="F2F2F2"/>
+            <w:tcBorders>
+              <w:top w:val="single" w:sz="4" w:space="0" w:color="CCCCCC"/>
+              <w:bottom w:val="single" w:sz="4" w:space="0" w:color="CCCCCC"/>
+              <w:left w:val="single" w:sz="4" w:space="0" w:color="CCCCCC"/>
+              <w:right w:val="single" w:sz="4" w:space="0" w:color="CCCCCC"/>
+            </w:tcBorders>
+            <w:vAlign w:val="center"/>
+          </w:tcPr>
+          <w:p>
+            <w:pPr>
+              <w:spacing w:before="0" w:after="0" w:line="276" w:lineRule="auto"/>
+              <w:jc w:val="center"/>
+            </w:pPr>
+            <w:r/>
+            <w:r>
+              <w:rPr>
+                <w:rFonts w:ascii="Times New Roman" w:hAnsi="Times New Roman"/>
+                <w:b/>
+                <w:i w:val="0"/>
+                <w:color w:val="000000"/>
+                <w:sz w:val="20"/>
+              </w:rPr>
+              <w:t xml:space="preserve">Satuan </w:t>
+            </w:r>
+            <w:r>
+              <w:rPr>
+                <w:rFonts w:ascii="Times New Roman" w:hAnsi="Times New Roman"/>
+                <w:b/>
+                <w:i w:val="0"/>
+                <w:color w:val="000000"/>
+                <w:sz w:val="20"/>
+              </w:rPr>
+              <w:t xml:space="preserve">Pendidikan </w:t>
+            </w:r>
+          </w:p>
+        </w:tc>
+        <w:tc>
+          <w:tcPr>
+            <w:tcW w:type="dxa" w:w="1417"/>
+            <w:tcMar>
+              <w:top w:w="60" w:type="dxa"/>
+              <w:bottom w:w="60" w:type="dxa"/>
+              <w:left w:w="100" w:type="dxa"/>
+              <w:right w:w="100" w:type="dxa"/>
+            </w:tcMar>
+            <w:shd w:fill="F2F2F2"/>
+            <w:tcBorders>
+              <w:top w:val="single" w:sz="4" w:space="0" w:color="CCCCCC"/>
+              <w:bottom w:val="single" w:sz="4" w:space="0" w:color="CCCCCC"/>
+              <w:left w:val="single" w:sz="4" w:space="0" w:color="CCCCCC"/>
+              <w:right w:val="single" w:sz="4" w:space="0" w:color="CCCCCC"/>
+            </w:tcBorders>
+            <w:vAlign w:val="center"/>
+          </w:tcPr>
+          <w:p>
+            <w:pPr>
+              <w:spacing w:before="0" w:after="0" w:line="276" w:lineRule="auto"/>
+              <w:jc w:val="center"/>
+            </w:pPr>
+            <w:r/>
+            <w:r>
+              <w:rPr>
+                <w:rFonts w:ascii="Times New Roman" w:hAnsi="Times New Roman"/>
+                <w:b/>
+                <w:i w:val="0"/>
+                <w:color w:val="000000"/>
+                <w:sz w:val="20"/>
+              </w:rPr>
+              <w:t xml:space="preserve">Peran </w:t>
+            </w:r>
+            <w:r>
+              <w:rPr>
+                <w:rFonts w:ascii="Times New Roman" w:hAnsi="Times New Roman"/>
+                <w:b/>
+                <w:i w:val="0"/>
+                <w:color w:val="000000"/>
+                <w:sz w:val="20"/>
+              </w:rPr>
+              <w:t xml:space="preserve">/ </w:t>
+            </w:r>
+            <w:r>
+              <w:rPr>
+                <w:rFonts w:ascii="Times New Roman" w:hAnsi="Times New Roman"/>
+                <w:b/>
+                <w:i w:val="0"/>
+                <w:color w:val="000000"/>
+                <w:sz w:val="20"/>
+              </w:rPr>
+              <w:t xml:space="preserve">Jabatan </w:t>
+            </w:r>
+          </w:p>
+        </w:tc>
+      </w:tr>
+      <w:tr>
+        <w:tc>
+          <w:tcPr>
+            <w:tcW w:type="dxa" w:w="1701"/>
+            <w:tcMar>
+              <w:top w:w="60" w:type="dxa"/>
+              <w:bottom w:w="60" w:type="dxa"/>
+              <w:left w:w="100" w:type="dxa"/>
+              <w:right w:w="100" w:type="dxa"/>
+            </w:tcMar>
+            <w:tcBorders>
+              <w:top w:val="single" w:sz="4" w:space="0" w:color="CCCCCC"/>
+              <w:bottom w:val="single" w:sz="4" w:space="0" w:color="CCCCCC"/>
+              <w:left w:val="single" w:sz="4" w:space="0" w:color="CCCCCC"/>
+              <w:right w:val="single" w:sz="4" w:space="0" w:color="CCCCCC"/>
+            </w:tcBorders>
+            <w:vAlign w:val="center"/>
+          </w:tcPr>
+          <w:p>
+            <w:pPr>
+              <w:spacing w:before="0" w:after="0" w:line="276" w:lineRule="auto"/>
+              <w:jc w:val="center"/>
+            </w:pPr>
+            <w:r/>
+            <w:r>
+              <w:rPr>
+                <w:rFonts w:ascii="Times New Roman" w:hAnsi="Times New Roman"/>
+                <w:b/>
+                <w:i w:val="0"/>
+                <w:color w:val="000000"/>
+                <w:sz w:val="20"/>
+              </w:rPr>
+              <w:t xml:space="preserve">0082633466 </w:t>
+            </w:r>
+          </w:p>
+        </w:tc>
+        <w:tc>
+          <w:tcPr>
+            <w:tcW w:type="dxa" w:w="2268"/>
+            <w:tcMar>
+              <w:top w:w="60" w:type="dxa"/>
+              <w:bottom w:w="60" w:type="dxa"/>
+              <w:left w:w="100" w:type="dxa"/>
+              <w:right w:w="100" w:type="dxa"/>
+            </w:tcMar>
+            <w:tcBorders>
+              <w:top w:val="single" w:sz="4" w:space="0" w:color="CCCCCC"/>
+              <w:bottom w:val="single" w:sz="4" w:space="0" w:color="CCCCCC"/>
+              <w:left w:val="single" w:sz="4" w:space="0" w:color="CCCCCC"/>
+              <w:right w:val="single" w:sz="4" w:space="0" w:color="CCCCCC"/>
+            </w:tcBorders>
+            <w:vAlign w:val="center"/>
+          </w:tcPr>
+          <w:p>
+            <w:pPr>
+              <w:spacing w:before="0" w:after="0" w:line="276" w:lineRule="auto"/>
+              <w:jc w:val="left"/>
+            </w:pPr>
+            <w:r/>
+            <w:r>
+              <w:rPr>
+                <w:rFonts w:ascii="Times New Roman" w:hAnsi="Times New Roman"/>
+                <w:b/>
+                <w:i w:val="0"/>
+                <w:color w:val="000000"/>
+                <w:sz w:val="20"/>
+              </w:rPr>
+              <w:t xml:space="preserve">Arief </w:t>
+            </w:r>
+            <w:r>
+              <w:rPr>
+                <w:rFonts w:ascii="Times New Roman" w:hAnsi="Times New Roman"/>
+                <w:b/>
+                <w:i w:val="0"/>
+                <w:color w:val="000000"/>
+                <w:sz w:val="20"/>
+              </w:rPr>
+              <w:t xml:space="preserve">Fajar </w:t>
+            </w:r>
+          </w:p>
+        </w:tc>
+        <w:tc>
+          <w:tcPr>
+            <w:tcW w:type="dxa" w:w="2551"/>
+            <w:tcMar>
+              <w:top w:w="60" w:type="dxa"/>
+              <w:bottom w:w="60" w:type="dxa"/>
+              <w:left w:w="100" w:type="dxa"/>
+              <w:right w:w="100" w:type="dxa"/>
+            </w:tcMar>
+            <w:tcBorders>
+              <w:top w:val="single" w:sz="4" w:space="0" w:color="CCCCCC"/>
+              <w:bottom w:val="single" w:sz="4" w:space="0" w:color="CCCCCC"/>
+              <w:left w:val="single" w:sz="4" w:space="0" w:color="CCCCCC"/>
+              <w:right w:val="single" w:sz="4" w:space="0" w:color="CCCCCC"/>
+            </w:tcBorders>
+            <w:vAlign w:val="center"/>
+          </w:tcPr>
+          <w:p>
+            <w:pPr>
+              <w:spacing w:before="0" w:after="0" w:line="276" w:lineRule="auto"/>
+              <w:jc w:val="left"/>
+            </w:pPr>
+            <w:r/>
+            <w:r>
+              <w:rPr>
+                <w:rFonts w:ascii="Times New Roman" w:hAnsi="Times New Roman"/>
+                <w:b w:val="0"/>
+                <w:i w:val="0"/>
+                <w:color w:val="000000"/>
+                <w:sz w:val="20"/>
+              </w:rPr>
+              <w:t xml:space="preserve">SMK </w:t>
+            </w:r>
+            <w:r>
+              <w:rPr>
+                <w:rFonts w:ascii="Times New Roman" w:hAnsi="Times New Roman"/>
+                <w:b w:val="0"/>
+                <w:i w:val="0"/>
+                <w:color w:val="000000"/>
+                <w:sz w:val="20"/>
+              </w:rPr>
+              <w:t xml:space="preserve">MARHAS </w:t>
+            </w:r>
+            <w:r>
+              <w:rPr>
+                <w:rFonts w:ascii="Times New Roman" w:hAnsi="Times New Roman"/>
+                <w:b w:val="0"/>
+                <w:i w:val="0"/>
+                <w:color w:val="000000"/>
+                <w:sz w:val="20"/>
+              </w:rPr>
+              <w:t xml:space="preserve">MARGAHAYU </w:t>
+            </w:r>
+          </w:p>
+        </w:tc>
+        <w:tc>
+          <w:tcPr>
+            <w:tcW w:type="dxa" w:w="1417"/>
+            <w:tcMar>
+              <w:top w:w="60" w:type="dxa"/>
+              <w:bottom w:w="60" w:type="dxa"/>
+              <w:left w:w="100" w:type="dxa"/>
+              <w:right w:w="100" w:type="dxa"/>
+            </w:tcMar>
+            <w:tcBorders>
+              <w:top w:val="single" w:sz="4" w:space="0" w:color="CCCCCC"/>
+              <w:bottom w:val="single" w:sz="4" w:space="0" w:color="CCCCCC"/>
+              <w:left w:val="single" w:sz="4" w:space="0" w:color="CCCCCC"/>
+              <w:right w:val="single" w:sz="4" w:space="0" w:color="CCCCCC"/>
+            </w:tcBorders>
+            <w:vAlign w:val="center"/>
+          </w:tcPr>
+          <w:p>
+            <w:pPr>
+              <w:spacing w:before="0" w:after="0" w:line="276" w:lineRule="auto"/>
+              <w:jc w:val="left"/>
+            </w:pPr>
+            <w:r/>
+            <w:r>
+              <w:rPr>
+                <w:rFonts w:ascii="Times New Roman" w:hAnsi="Times New Roman"/>
+                <w:b w:val="0"/>
+                <w:i w:val="0"/>
+                <w:color w:val="000000"/>
+                <w:sz w:val="20"/>
+              </w:rPr>
+              <w:t xml:space="preserve">Ketua </w:t>
+            </w:r>
+            <w:r>
+              <w:rPr>
+                <w:rFonts w:ascii="Times New Roman" w:hAnsi="Times New Roman"/>
+                <w:b w:val="0"/>
+                <w:i w:val="0"/>
+                <w:color w:val="000000"/>
+                <w:sz w:val="20"/>
+              </w:rPr>
+              <w:t xml:space="preserve">Tim </w:t>
+            </w:r>
+          </w:p>
+        </w:tc>
+      </w:tr>
+      <w:tr>
+        <w:tc>
+          <w:tcPr>
+            <w:tcW w:type="dxa" w:w="1701"/>
+            <w:tcMar>
+              <w:top w:w="60" w:type="dxa"/>
+              <w:bottom w:w="60" w:type="dxa"/>
+              <w:left w:w="100" w:type="dxa"/>
+              <w:right w:w="100" w:type="dxa"/>
+            </w:tcMar>
+            <w:tcBorders>
+              <w:top w:val="single" w:sz="4" w:space="0" w:color="CCCCCC"/>
+              <w:bottom w:val="single" w:sz="4" w:space="0" w:color="CCCCCC"/>
+              <w:left w:val="single" w:sz="4" w:space="0" w:color="CCCCCC"/>
+              <w:right w:val="single" w:sz="4" w:space="0" w:color="CCCCCC"/>
+            </w:tcBorders>
+            <w:vAlign w:val="center"/>
+          </w:tcPr>
+          <w:p>
+            <w:pPr>
+              <w:spacing w:before="0" w:after="0" w:line="276" w:lineRule="auto"/>
+              <w:jc w:val="center"/>
+            </w:pPr>
+            <w:r/>
+            <w:r>
+              <w:rPr>
+                <w:rFonts w:ascii="Times New Roman" w:hAnsi="Times New Roman"/>
+                <w:b/>
+                <w:i w:val="0"/>
+                <w:color w:val="000000"/>
+                <w:sz w:val="20"/>
+              </w:rPr>
+              <w:t xml:space="preserve">0082941227 </w:t>
+            </w:r>
+          </w:p>
+        </w:tc>
+        <w:tc>
+          <w:tcPr>
+            <w:tcW w:type="dxa" w:w="2268"/>
+            <w:tcMar>
+              <w:top w:w="60" w:type="dxa"/>
+              <w:bottom w:w="60" w:type="dxa"/>
+              <w:left w:w="100" w:type="dxa"/>
+              <w:right w:w="100" w:type="dxa"/>
+            </w:tcMar>
+            <w:tcBorders>
+              <w:top w:val="single" w:sz="4" w:space="0" w:color="CCCCCC"/>
+              <w:bottom w:val="single" w:sz="4" w:space="0" w:color="CCCCCC"/>
+              <w:left w:val="single" w:sz="4" w:space="0" w:color="CCCCCC"/>
+              <w:right w:val="single" w:sz="4" w:space="0" w:color="CCCCCC"/>
+            </w:tcBorders>
+            <w:vAlign w:val="center"/>
+          </w:tcPr>
+          <w:p>
+            <w:pPr>
+              <w:spacing w:before="0" w:after="0" w:line="276" w:lineRule="auto"/>
+              <w:jc w:val="left"/>
+            </w:pPr>
+            <w:r/>
+            <w:r>
+              <w:rPr>
+                <w:rFonts w:ascii="Times New Roman" w:hAnsi="Times New Roman"/>
+                <w:b/>
+                <w:i w:val="0"/>
+                <w:color w:val="000000"/>
+                <w:sz w:val="20"/>
+              </w:rPr>
+              <w:t xml:space="preserve">Alysia </w:t>
+            </w:r>
+            <w:r>
+              <w:rPr>
+                <w:rFonts w:ascii="Times New Roman" w:hAnsi="Times New Roman"/>
+                <w:b/>
+                <w:i w:val="0"/>
+                <w:color w:val="000000"/>
+                <w:sz w:val="20"/>
+              </w:rPr>
+              <w:t xml:space="preserve">Fasma </w:t>
+            </w:r>
+            <w:r>
+              <w:rPr>
+                <w:rFonts w:ascii="Times New Roman" w:hAnsi="Times New Roman"/>
+                <w:b/>
+                <w:i w:val="0"/>
+                <w:color w:val="000000"/>
+                <w:sz w:val="20"/>
+              </w:rPr>
+              <w:t xml:space="preserve">Nidai </w:t>
+            </w:r>
+          </w:p>
+        </w:tc>
+        <w:tc>
+          <w:tcPr>
+            <w:tcW w:type="dxa" w:w="2551"/>
+            <w:tcMar>
+              <w:top w:w="60" w:type="dxa"/>
+              <w:bottom w:w="60" w:type="dxa"/>
+              <w:left w:w="100" w:type="dxa"/>
+              <w:right w:w="100" w:type="dxa"/>
+            </w:tcMar>
+            <w:tcBorders>
+              <w:top w:val="single" w:sz="4" w:space="0" w:color="CCCCCC"/>
+              <w:bottom w:val="single" w:sz="4" w:space="0" w:color="CCCCCC"/>
+              <w:left w:val="single" w:sz="4" w:space="0" w:color="CCCCCC"/>
+              <w:right w:val="single" w:sz="4" w:space="0" w:color="CCCCCC"/>
+            </w:tcBorders>
+            <w:vAlign w:val="center"/>
+          </w:tcPr>
+          <w:p>
+            <w:pPr>
+              <w:spacing w:before="0" w:after="0" w:line="276" w:lineRule="auto"/>
+              <w:jc w:val="left"/>
+            </w:pPr>
+            <w:r/>
+            <w:r>
+              <w:rPr>
+                <w:rFonts w:ascii="Times New Roman" w:hAnsi="Times New Roman"/>
+                <w:b w:val="0"/>
+                <w:i w:val="0"/>
+                <w:color w:val="000000"/>
+                <w:sz w:val="20"/>
+              </w:rPr>
+              <w:t xml:space="preserve">SMK </w:t>
+            </w:r>
+            <w:r>
+              <w:rPr>
+                <w:rFonts w:ascii="Times New Roman" w:hAnsi="Times New Roman"/>
+                <w:b w:val="0"/>
+                <w:i w:val="0"/>
+                <w:color w:val="000000"/>
+                <w:sz w:val="20"/>
+              </w:rPr>
+              <w:t xml:space="preserve">MARHAS </w:t>
+            </w:r>
+            <w:r>
+              <w:rPr>
+                <w:rFonts w:ascii="Times New Roman" w:hAnsi="Times New Roman"/>
+                <w:b w:val="0"/>
+                <w:i w:val="0"/>
+                <w:color w:val="000000"/>
+                <w:sz w:val="20"/>
+              </w:rPr>
+              <w:t xml:space="preserve">MARGAHAYU </w:t>
+            </w:r>
+          </w:p>
+        </w:tc>
+        <w:tc>
+          <w:tcPr>
+            <w:tcW w:type="dxa" w:w="1417"/>
+            <w:tcMar>
+              <w:top w:w="60" w:type="dxa"/>
+              <w:bottom w:w="60" w:type="dxa"/>
+              <w:left w:w="100" w:type="dxa"/>
+              <w:right w:w="100" w:type="dxa"/>
+            </w:tcMar>
+            <w:tcBorders>
+              <w:top w:val="single" w:sz="4" w:space="0" w:color="CCCCCC"/>
+              <w:bottom w:val="single" w:sz="4" w:space="0" w:color="CCCCCC"/>
+              <w:left w:val="single" w:sz="4" w:space="0" w:color="CCCCCC"/>
+              <w:right w:val="single" w:sz="4" w:space="0" w:color="CCCCCC"/>
+            </w:tcBorders>
+            <w:vAlign w:val="center"/>
+          </w:tcPr>
+          <w:p>
+            <w:pPr>
+              <w:spacing w:before="0" w:after="0" w:line="276" w:lineRule="auto"/>
+              <w:jc w:val="left"/>
+            </w:pPr>
+            <w:r/>
+            <w:r>
+              <w:rPr>
+                <w:rFonts w:ascii="Times New Roman" w:hAnsi="Times New Roman"/>
+                <w:b w:val="0"/>
+                <w:i w:val="0"/>
+                <w:color w:val="000000"/>
+                <w:sz w:val="20"/>
+              </w:rPr>
+              <w:t xml:space="preserve">Anggota </w:t>
+            </w:r>
+            <w:r>
+              <w:rPr>
+                <w:rFonts w:ascii="Times New Roman" w:hAnsi="Times New Roman"/>
+                <w:b w:val="0"/>
+                <w:i w:val="0"/>
+                <w:color w:val="000000"/>
+                <w:sz w:val="20"/>
+              </w:rPr>
+              <w:t xml:space="preserve">Tim </w:t>
+            </w:r>
+          </w:p>
+        </w:tc>
+      </w:tr>
+      <w:tr>
+        <w:tc>
+          <w:tcPr>
+            <w:tcW w:type="dxa" w:w="1701"/>
+            <w:tcMar>
+              <w:top w:w="60" w:type="dxa"/>
+              <w:bottom w:w="60" w:type="dxa"/>
+              <w:left w:w="100" w:type="dxa"/>
+              <w:right w:w="100" w:type="dxa"/>
+            </w:tcMar>
+            <w:tcBorders>
+              <w:top w:val="single" w:sz="4" w:space="0" w:color="CCCCCC"/>
+              <w:bottom w:val="single" w:sz="4" w:space="0" w:color="CCCCCC"/>
+              <w:left w:val="single" w:sz="4" w:space="0" w:color="CCCCCC"/>
+              <w:right w:val="single" w:sz="4" w:space="0" w:color="CCCCCC"/>
+            </w:tcBorders>
+            <w:vAlign w:val="center"/>
+          </w:tcPr>
+          <w:p>
+            <w:pPr>
+              <w:spacing w:before="0" w:after="0" w:line="276" w:lineRule="auto"/>
+              <w:jc w:val="center"/>
+            </w:pPr>
+            <w:r/>
+            <w:r>
+              <w:rPr>
+                <w:rFonts w:ascii="Times New Roman" w:hAnsi="Times New Roman"/>
+                <w:b/>
+                <w:i w:val="0"/>
+                <w:color w:val="000000"/>
+                <w:sz w:val="20"/>
+              </w:rPr>
+              <w:t xml:space="preserve">0093018181 </w:t>
+            </w:r>
+          </w:p>
+        </w:tc>
+        <w:tc>
+          <w:tcPr>
+            <w:tcW w:type="dxa" w:w="2268"/>
+            <w:tcMar>
+              <w:top w:w="60" w:type="dxa"/>
+              <w:bottom w:w="60" w:type="dxa"/>
+              <w:left w:w="100" w:type="dxa"/>
+              <w:right w:w="100" w:type="dxa"/>
+            </w:tcMar>
+            <w:tcBorders>
+              <w:top w:val="single" w:sz="4" w:space="0" w:color="CCCCCC"/>
+              <w:bottom w:val="single" w:sz="4" w:space="0" w:color="CCCCCC"/>
+              <w:left w:val="single" w:sz="4" w:space="0" w:color="CCCCCC"/>
+              <w:right w:val="single" w:sz="4" w:space="0" w:color="CCCCCC"/>
+            </w:tcBorders>
+            <w:vAlign w:val="center"/>
+          </w:tcPr>
+          <w:p>
+            <w:pPr>
+              <w:spacing w:before="0" w:after="0" w:line="276" w:lineRule="auto"/>
+              <w:jc w:val="left"/>
+            </w:pPr>
+            <w:r/>
+            <w:r>
+              <w:rPr>
+                <w:rFonts w:ascii="Times New Roman" w:hAnsi="Times New Roman"/>
+                <w:b/>
+                <w:i w:val="0"/>
+                <w:color w:val="000000"/>
+                <w:sz w:val="20"/>
+              </w:rPr>
+              <w:t xml:space="preserve">Reza </w:t>
+            </w:r>
+            <w:r>
+              <w:rPr>
+                <w:rFonts w:ascii="Times New Roman" w:hAnsi="Times New Roman"/>
+                <w:b/>
+                <w:i w:val="0"/>
+                <w:color w:val="000000"/>
+                <w:sz w:val="20"/>
+              </w:rPr>
+              <w:t xml:space="preserve">Arrofi </w:t>
+            </w:r>
+          </w:p>
+        </w:tc>
+        <w:tc>
+          <w:tcPr>
+            <w:tcW w:type="dxa" w:w="2551"/>
+            <w:tcMar>
+              <w:top w:w="60" w:type="dxa"/>
+              <w:bottom w:w="60" w:type="dxa"/>
+              <w:left w:w="100" w:type="dxa"/>
+              <w:right w:w="100" w:type="dxa"/>
+            </w:tcMar>
+            <w:tcBorders>
+              <w:top w:val="single" w:sz="4" w:space="0" w:color="CCCCCC"/>
+              <w:bottom w:val="single" w:sz="4" w:space="0" w:color="CCCCCC"/>
+              <w:left w:val="single" w:sz="4" w:space="0" w:color="CCCCCC"/>
+              <w:right w:val="single" w:sz="4" w:space="0" w:color="CCCCCC"/>
+            </w:tcBorders>
+            <w:vAlign w:val="center"/>
+          </w:tcPr>
+          <w:p>
+            <w:pPr>
+              <w:spacing w:before="0" w:after="0" w:line="276" w:lineRule="auto"/>
+              <w:jc w:val="left"/>
+            </w:pPr>
+            <w:r/>
+            <w:r>
+              <w:rPr>
+                <w:rFonts w:ascii="Times New Roman" w:hAnsi="Times New Roman"/>
+                <w:b w:val="0"/>
+                <w:i w:val="0"/>
+                <w:color w:val="000000"/>
+                <w:sz w:val="20"/>
+              </w:rPr>
+              <w:t xml:space="preserve">SMK </w:t>
+            </w:r>
+            <w:r>
+              <w:rPr>
+                <w:rFonts w:ascii="Times New Roman" w:hAnsi="Times New Roman"/>
+                <w:b w:val="0"/>
+                <w:i w:val="0"/>
+                <w:color w:val="000000"/>
+                <w:sz w:val="20"/>
+              </w:rPr>
+              <w:t xml:space="preserve">MARHAS </w:t>
+            </w:r>
+            <w:r>
+              <w:rPr>
+                <w:rFonts w:ascii="Times New Roman" w:hAnsi="Times New Roman"/>
+                <w:b w:val="0"/>
+                <w:i w:val="0"/>
+                <w:color w:val="000000"/>
+                <w:sz w:val="20"/>
+              </w:rPr>
+              <w:t xml:space="preserve">MARGAHAYU </w:t>
+            </w:r>
+          </w:p>
+        </w:tc>
+        <w:tc>
+          <w:tcPr>
+            <w:tcW w:type="dxa" w:w="1417"/>
+            <w:tcMar>
+              <w:top w:w="60" w:type="dxa"/>
+              <w:bottom w:w="60" w:type="dxa"/>
+              <w:left w:w="100" w:type="dxa"/>
+              <w:right w:w="100" w:type="dxa"/>
+            </w:tcMar>
+            <w:tcBorders>
+              <w:top w:val="single" w:sz="4" w:space="0" w:color="CCCCCC"/>
+              <w:bottom w:val="single" w:sz="4" w:space="0" w:color="CCCCCC"/>
+              <w:left w:val="single" w:sz="4" w:space="0" w:color="CCCCCC"/>
+              <w:right w:val="single" w:sz="4" w:space="0" w:color="CCCCCC"/>
+            </w:tcBorders>
+            <w:vAlign w:val="center"/>
+          </w:tcPr>
+          <w:p>
+            <w:pPr>
+              <w:spacing w:before="0" w:after="0" w:line="276" w:lineRule="auto"/>
+              <w:jc w:val="left"/>
+            </w:pPr>
+            <w:r/>
+            <w:r>
+              <w:rPr>
+                <w:rFonts w:ascii="Times New Roman" w:hAnsi="Times New Roman"/>
+                <w:b w:val="0"/>
+                <w:i w:val="0"/>
+                <w:color w:val="000000"/>
+                <w:sz w:val="20"/>
+              </w:rPr>
+              <w:t xml:space="preserve">Anggota </w:t>
+            </w:r>
+            <w:r>
+              <w:rPr>
+                <w:rFonts w:ascii="Times New Roman" w:hAnsi="Times New Roman"/>
+                <w:b w:val="0"/>
+                <w:i w:val="0"/>
+                <w:color w:val="000000"/>
+                <w:sz w:val="20"/>
+              </w:rPr>
+              <w:t xml:space="preserve">Tim </w:t>
+            </w:r>
+          </w:p>
+        </w:tc>
+      </w:tr>
+    </w:tbl>
+    <w:p>
+      <w:pPr>
+        <w:spacing w:before="800"/>
+        <w:jc w:val="center"/>
+      </w:pPr>
+      <w:r>
+        <w:rPr>
+          <w:rFonts w:ascii="Times New Roman" w:hAnsi="Times New Roman"/>
+          <w:b/>
+          <w:sz w:val="22"/>
         </w:rPr>
         <w:t>EKSHIBISI TEKNOLOGI AI — LKS NASIONAL 2026</w:t>
         <w:br/>
-        <w:t>Disusun Oleh:</w:t>
+        <w:t>KEMENTERIAN PENDIDIKAN, KEBUDAYAAN, RISET, DAN TEKNOLOGI</w:t>
         <w:br/>
-        <w:t>Tim Pengembang Antigravity Genesis</w:t>
-        <w:br/>
-        <w:t>Republik Indonesia</w:t>
+        <w:t>REPUBLIK INDONESIA</w:t>
         <w:br/>
         <w:t>2026</w:t>
       </w:r>
@@ -74,157 +865,315 @@
           <w:color w:val="000000"/>
           <w:sz w:val="24"/>
         </w:rPr>
-        <w:t>1.1 Ringkasan Eksekutif</w:t>
+        <w:t xml:space="preserve"> DAFTAR ISI</w:t>
       </w:r>
     </w:p>
     <w:p>
       <w:pPr>
-        <w:spacing w:before="0" w:after="80" w:line="360" w:lineRule="auto"/>
-        <w:ind w:firstLine="720"/>
-        <w:jc w:val="both"/>
+        <w:spacing w:after="80" w:line="276" w:lineRule="auto"/>
       </w:pPr>
       <w:r>
         <w:rPr>
           <w:rFonts w:ascii="Times New Roman" w:hAnsi="Times New Roman"/>
-          <w:b w:val="0"/>
-          <w:i w:val="0"/>
-          <w:color w:val="000000"/>
+          <w:b/>
           <w:sz w:val="24"/>
         </w:rPr>
-        <w:t>Sistem tata kelola lingkungan modern menuntut adanya integrasi yang erat antara peran aktif masyarakat luas (</w:t>
+        <w:t xml:space="preserve">I. </w:t>
       </w:r>
       <w:r>
         <w:rPr>
           <w:rFonts w:ascii="Times New Roman" w:hAnsi="Times New Roman"/>
-          <w:b w:val="0"/>
-          <w:i/>
-          <w:color w:val="000000"/>
           <w:sz w:val="24"/>
         </w:rPr>
-        <w:t>crowdsourcing</w:t>
-      </w:r>
-      <w:r>
-        <w:rPr>
-          <w:rFonts w:ascii="Times New Roman" w:hAnsi="Times New Roman"/>
-          <w:b w:val="0"/>
-          <w:i w:val="0"/>
-          <w:color w:val="000000"/>
-          <w:sz w:val="24"/>
-        </w:rPr>
-        <w:t xml:space="preserve">) dengan pemrosesan data otomatis berbasis kecerdasan artifisial. Platform </w:t>
+        <w:t xml:space="preserve">RINGKASAN EKSEKUTIF &amp; LATAR BELAKANG .................................................................................. </w:t>
       </w:r>
       <w:r>
         <w:rPr>
           <w:rFonts w:ascii="Times New Roman" w:hAnsi="Times New Roman"/>
           <w:b/>
-          <w:i w:val="0"/>
-          <w:color w:val="000000"/>
           <w:sz w:val="24"/>
         </w:rPr>
-        <w:t>Genesis</w:t>
-      </w:r>
-      <w:r>
-        <w:rPr>
-          <w:rFonts w:ascii="Times New Roman" w:hAnsi="Times New Roman"/>
-          <w:b w:val="0"/>
-          <w:i w:val="0"/>
-          <w:color w:val="000000"/>
-          <w:sz w:val="24"/>
-        </w:rPr>
-        <w:t xml:space="preserve"> dikembangkan untuk mengatasi ketimpangan koordinasi penanganan laporan lingkungan hidup di Indonesia dengan menyajikan arsitektur multi-layanan yang handal, cepat, aman, dan dapat dipertanggungjawabkan (</w:t>
-      </w:r>
-      <w:r>
-        <w:rPr>
-          <w:rFonts w:ascii="Times New Roman" w:hAnsi="Times New Roman"/>
-          <w:b w:val="0"/>
-          <w:i/>
-          <w:color w:val="000000"/>
-          <w:sz w:val="24"/>
-        </w:rPr>
-        <w:t>Responsible AI</w:t>
-      </w:r>
-      <w:r>
-        <w:rPr>
-          <w:rFonts w:ascii="Times New Roman" w:hAnsi="Times New Roman"/>
-          <w:b w:val="0"/>
-          <w:i w:val="0"/>
-          <w:color w:val="000000"/>
-          <w:sz w:val="24"/>
-        </w:rPr>
-        <w:t>). Dokumen teknis ini memaparkan rancangan struktural, pipeline transmisi data, sistem penalaran kognitif AI, hingga aspek gamifikasi yang mendasari keandalan platform Genesis.</w:t>
+        <w:t>3</w:t>
       </w:r>
     </w:p>
     <w:p>
       <w:pPr>
-        <w:keepNext/>
-        <w:spacing w:before="240" w:after="80" w:line="276" w:lineRule="auto"/>
-        <w:jc w:val="left"/>
+        <w:spacing w:after="80" w:line="276" w:lineRule="auto"/>
       </w:pPr>
       <w:r>
         <w:rPr>
           <w:rFonts w:ascii="Times New Roman" w:hAnsi="Times New Roman"/>
           <w:b/>
-          <w:color w:val="000000"/>
           <w:sz w:val="24"/>
         </w:rPr>
-        <w:t>1.2 Latar Belakang dan Batasan Masalah</w:t>
+        <w:t xml:space="preserve">II. </w:t>
       </w:r>
-    </w:p>
-    <w:p>
-      <w:pPr>
-        <w:spacing w:before="0" w:after="80" w:line="360" w:lineRule="auto"/>
-        <w:ind w:firstLine="720"/>
-        <w:jc w:val="both"/>
-      </w:pPr>
       <w:r>
         <w:rPr>
           <w:rFonts w:ascii="Times New Roman" w:hAnsi="Times New Roman"/>
-          <w:b w:val="0"/>
-          <w:i w:val="0"/>
-          <w:color w:val="000000"/>
           <w:sz w:val="24"/>
         </w:rPr>
-        <w:t xml:space="preserve">Aksi iklim lokal sering kali terhambat oleh lambatnya proses verifikasi administratif dan keterbatasan data spasial real-time bagi Dinas Lingkungan Hidup (DLH). Laporan yang dikirimkan warga kerap berulang, tidak memiliki koordinat presisi, serta mengandung informasi sensitif pribadi yang melanggar privasi publik. Genesis mengatasi hal tersebut melalui integrasi sistem validasi spasial </w:t>
+        <w:t xml:space="preserve">ARSITEKTUR ENTERPRISE INTEGRASI SISTEM ............................................................................... </w:t>
       </w:r>
       <w:r>
         <w:rPr>
           <w:rFonts w:ascii="Times New Roman" w:hAnsi="Times New Roman"/>
           <w:b/>
-          <w:i w:val="0"/>
-          <w:color w:val="000000"/>
           <w:sz w:val="24"/>
         </w:rPr>
-        <w:t>PostGIS</w:t>
+        <w:t>4</w:t>
+      </w:r>
+    </w:p>
+    <w:p>
+      <w:pPr>
+        <w:spacing w:after="80" w:line="276" w:lineRule="auto"/>
+      </w:pPr>
+      <w:r>
+        <w:rPr>
+          <w:rFonts w:ascii="Times New Roman" w:hAnsi="Times New Roman"/>
+          <w:b/>
+          <w:sz w:val="24"/>
+        </w:rPr>
+        <w:t xml:space="preserve">III. </w:t>
       </w:r>
       <w:r>
         <w:rPr>
           <w:rFonts w:ascii="Times New Roman" w:hAnsi="Times New Roman"/>
-          <w:b w:val="0"/>
-          <w:i/>
-          <w:color w:val="000000"/>
           <w:sz w:val="24"/>
         </w:rPr>
-        <w:t>, sensor buram wajah in-memory, serta perutean model kecerdasan artifisial dinamis (</w:t>
+        <w:t xml:space="preserve">ALIRAN INTERAKSI KOMPONEN &amp; SKEMA GRAFIS ............................................................................ </w:t>
       </w:r>
       <w:r>
         <w:rPr>
           <w:rFonts w:ascii="Times New Roman" w:hAnsi="Times New Roman"/>
-          <w:b w:val="0"/>
-          <w:i/>
-          <w:color w:val="000000"/>
+          <w:b/>
           <w:sz w:val="24"/>
         </w:rPr>
-        <w:t>dynamic model routing</w:t>
+        <w:t>5</w:t>
+      </w:r>
+    </w:p>
+    <w:p>
+      <w:pPr>
+        <w:spacing w:after="80" w:line="276" w:lineRule="auto"/>
+      </w:pPr>
+      <w:r>
+        <w:rPr>
+          <w:rFonts w:ascii="Times New Roman" w:hAnsi="Times New Roman"/>
+          <w:b/>
+          <w:sz w:val="24"/>
+        </w:rPr>
+        <w:t xml:space="preserve">IV. </w:t>
       </w:r>
       <w:r>
         <w:rPr>
           <w:rFonts w:ascii="Times New Roman" w:hAnsi="Times New Roman"/>
-          <w:b w:val="0"/>
-          <w:i w:val="0"/>
-          <w:color w:val="000000"/>
           <w:sz w:val="24"/>
         </w:rPr>
-        <w:t>) untuk menjamin skalabilitas operasional dan efisiensi biaya secara berkelanjutan.</w:t>
+        <w:t xml:space="preserve">PIPELINE DETEKSI SPASIAL &amp; SENSOR CITRA .............................................................................. </w:t>
+      </w:r>
+      <w:r>
+        <w:rPr>
+          <w:rFonts w:ascii="Times New Roman" w:hAnsi="Times New Roman"/>
+          <w:b/>
+          <w:sz w:val="24"/>
+        </w:rPr>
+        <w:t>6</w:t>
+      </w:r>
+    </w:p>
+    <w:p>
+      <w:pPr>
+        <w:spacing w:after="80" w:line="276" w:lineRule="auto"/>
+      </w:pPr>
+      <w:r>
+        <w:rPr>
+          <w:rFonts w:ascii="Times New Roman" w:hAnsi="Times New Roman"/>
+          <w:b/>
+          <w:sz w:val="24"/>
+        </w:rPr>
+        <w:t xml:space="preserve">V. </w:t>
+      </w:r>
+      <w:r>
+        <w:rPr>
+          <w:rFonts w:ascii="Times New Roman" w:hAnsi="Times New Roman"/>
+          <w:sz w:val="24"/>
+        </w:rPr>
+        <w:t xml:space="preserve">TABEL TAHAPAN PIPELINE &amp; AMBANG BATAS HITL ............................................................................ </w:t>
+      </w:r>
+      <w:r>
+        <w:rPr>
+          <w:rFonts w:ascii="Times New Roman" w:hAnsi="Times New Roman"/>
+          <w:b/>
+          <w:sz w:val="24"/>
+        </w:rPr>
+        <w:t>7</w:t>
+      </w:r>
+    </w:p>
+    <w:p>
+      <w:pPr>
+        <w:spacing w:after="80" w:line="276" w:lineRule="auto"/>
+      </w:pPr>
+      <w:r>
+        <w:rPr>
+          <w:rFonts w:ascii="Times New Roman" w:hAnsi="Times New Roman"/>
+          <w:b/>
+          <w:sz w:val="24"/>
+        </w:rPr>
+        <w:t xml:space="preserve">VI. </w:t>
+      </w:r>
+      <w:r>
+        <w:rPr>
+          <w:rFonts w:ascii="Times New Roman" w:hAnsi="Times New Roman"/>
+          <w:sz w:val="24"/>
+        </w:rPr>
+        <w:t xml:space="preserve">SSE STREAMING &amp; LOGICAL REASONING AI CHAT ............................................................................ </w:t>
+      </w:r>
+      <w:r>
+        <w:rPr>
+          <w:rFonts w:ascii="Times New Roman" w:hAnsi="Times New Roman"/>
+          <w:b/>
+          <w:sz w:val="24"/>
+        </w:rPr>
+        <w:t>8</w:t>
+      </w:r>
+    </w:p>
+    <w:p>
+      <w:pPr>
+        <w:spacing w:after="80" w:line="276" w:lineRule="auto"/>
+      </w:pPr>
+      <w:r>
+        <w:rPr>
+          <w:rFonts w:ascii="Times New Roman" w:hAnsi="Times New Roman"/>
+          <w:b/>
+          <w:sz w:val="24"/>
+        </w:rPr>
+        <w:t xml:space="preserve">VII. </w:t>
+      </w:r>
+      <w:r>
+        <w:rPr>
+          <w:rFonts w:ascii="Times New Roman" w:hAnsi="Times New Roman"/>
+          <w:sz w:val="24"/>
+        </w:rPr>
+        <w:t xml:space="preserve">HYBRID RAG &amp; PERUTEAN MODEL DINAMIS ................................................................................. </w:t>
+      </w:r>
+      <w:r>
+        <w:rPr>
+          <w:rFonts w:ascii="Times New Roman" w:hAnsi="Times New Roman"/>
+          <w:b/>
+          <w:sz w:val="24"/>
+        </w:rPr>
+        <w:t>9</w:t>
+      </w:r>
+    </w:p>
+    <w:p>
+      <w:pPr>
+        <w:spacing w:after="80" w:line="276" w:lineRule="auto"/>
+      </w:pPr>
+      <w:r>
+        <w:rPr>
+          <w:rFonts w:ascii="Times New Roman" w:hAnsi="Times New Roman"/>
+          <w:b/>
+          <w:sz w:val="24"/>
+        </w:rPr>
+        <w:t xml:space="preserve">VIII. </w:t>
+      </w:r>
+      <w:r>
+        <w:rPr>
+          <w:rFonts w:ascii="Times New Roman" w:hAnsi="Times New Roman"/>
+          <w:sz w:val="24"/>
+        </w:rPr>
+        <w:t xml:space="preserve">MESIN GAMIFIKASI &amp; LEADERBOARD DATA RIIL ........................................................................... </w:t>
+      </w:r>
+      <w:r>
+        <w:rPr>
+          <w:rFonts w:ascii="Times New Roman" w:hAnsi="Times New Roman"/>
+          <w:b/>
+          <w:sz w:val="24"/>
+        </w:rPr>
+        <w:t>10</w:t>
+      </w:r>
+    </w:p>
+    <w:p>
+      <w:pPr>
+        <w:spacing w:after="80" w:line="276" w:lineRule="auto"/>
+      </w:pPr>
+      <w:r>
+        <w:rPr>
+          <w:rFonts w:ascii="Times New Roman" w:hAnsi="Times New Roman"/>
+          <w:b/>
+          <w:sz w:val="24"/>
+        </w:rPr>
+        <w:t xml:space="preserve">IX. </w:t>
+      </w:r>
+      <w:r>
+        <w:rPr>
+          <w:rFonts w:ascii="Times New Roman" w:hAnsi="Times New Roman"/>
+          <w:sz w:val="24"/>
+        </w:rPr>
+        <w:t xml:space="preserve">RESPONSIBLE AI &amp; SAFETY-BY-DESIGN GUIDELINES ......................................................................... </w:t>
+      </w:r>
+      <w:r>
+        <w:rPr>
+          <w:rFonts w:ascii="Times New Roman" w:hAnsi="Times New Roman"/>
+          <w:b/>
+          <w:sz w:val="24"/>
+        </w:rPr>
+        <w:t>11</w:t>
+      </w:r>
+    </w:p>
+    <w:p>
+      <w:pPr>
+        <w:spacing w:after="80" w:line="276" w:lineRule="auto"/>
+      </w:pPr>
+      <w:r>
+        <w:rPr>
+          <w:rFonts w:ascii="Times New Roman" w:hAnsi="Times New Roman"/>
+          <w:b/>
+          <w:sz w:val="24"/>
+        </w:rPr>
+        <w:t xml:space="preserve">X. </w:t>
+      </w:r>
+      <w:r>
+        <w:rPr>
+          <w:rFonts w:ascii="Times New Roman" w:hAnsi="Times New Roman"/>
+          <w:sz w:val="24"/>
+        </w:rPr>
+        <w:t xml:space="preserve">RENCANA PENGUJIAN, SKALABILITAS, &amp; VERIFIKASI ......................................................................... </w:t>
+      </w:r>
+      <w:r>
+        <w:rPr>
+          <w:rFonts w:ascii="Times New Roman" w:hAnsi="Times New Roman"/>
+          <w:b/>
+          <w:sz w:val="24"/>
+        </w:rPr>
+        <w:t>12</w:t>
+      </w:r>
+    </w:p>
+    <w:p>
+      <w:pPr>
+        <w:spacing w:after="80" w:line="276" w:lineRule="auto"/>
+      </w:pPr>
+      <w:r>
+        <w:rPr>
+          <w:rFonts w:ascii="Times New Roman" w:hAnsi="Times New Roman"/>
+          <w:b/>
+          <w:sz w:val="24"/>
+        </w:rPr>
+        <w:t xml:space="preserve">XI. </w:t>
+      </w:r>
+      <w:r>
+        <w:rPr>
+          <w:rFonts w:ascii="Times New Roman" w:hAnsi="Times New Roman"/>
+          <w:sz w:val="24"/>
+        </w:rPr>
+        <w:t xml:space="preserve">DAFTAR PUSTAKA (APA 7TH EDITION) ..................................................................................... </w:t>
+      </w:r>
+      <w:r>
+        <w:rPr>
+          <w:rFonts w:ascii="Times New Roman" w:hAnsi="Times New Roman"/>
+          <w:b/>
+          <w:sz w:val="24"/>
+        </w:rPr>
+        <w:t>13</w:t>
       </w:r>
     </w:p>
     <w:p>
@@ -245,12 +1194,106 @@
           <w:color w:val="000000"/>
           <w:sz w:val="24"/>
         </w:rPr>
-        <w:t>2.1 Arsitektur Enterprise Sistem</w:t>
+        <w:t>I. RINGKASAN EKSEKUTIF &amp; LATAR BELAKANG</w:t>
       </w:r>
     </w:p>
     <w:p>
       <w:pPr>
-        <w:spacing w:before="0" w:after="80" w:line="360" w:lineRule="auto"/>
+        <w:spacing w:before="0" w:after="120" w:line="360" w:lineRule="auto"/>
+        <w:ind w:firstLine="720"/>
+        <w:jc w:val="both"/>
+      </w:pPr>
+      <w:r>
+        <w:rPr>
+          <w:rFonts w:ascii="Times New Roman" w:hAnsi="Times New Roman"/>
+          <w:b w:val="0"/>
+          <w:i w:val="0"/>
+          <w:color w:val="000000"/>
+          <w:sz w:val="24"/>
+        </w:rPr>
+        <w:t>Sistem tata kelola lingkungan hidup di era modern menuntut adanya sinergi yang harmonis antara partisipasi publik aktif (</w:t>
+      </w:r>
+      <w:r>
+        <w:rPr>
+          <w:rFonts w:ascii="Times New Roman" w:hAnsi="Times New Roman"/>
+          <w:b w:val="0"/>
+          <w:i/>
+          <w:color w:val="000000"/>
+          <w:sz w:val="24"/>
+        </w:rPr>
+        <w:t>crowdsourcing</w:t>
+      </w:r>
+      <w:r>
+        <w:rPr>
+          <w:rFonts w:ascii="Times New Roman" w:hAnsi="Times New Roman"/>
+          <w:b w:val="0"/>
+          <w:i w:val="0"/>
+          <w:color w:val="000000"/>
+          <w:sz w:val="24"/>
+        </w:rPr>
+        <w:t xml:space="preserve">) dengan kapasitas pengolahan data otomatis berbasis kecerdasan artifisial. Platform </w:t>
+      </w:r>
+      <w:r>
+        <w:rPr>
+          <w:rFonts w:ascii="Times New Roman" w:hAnsi="Times New Roman"/>
+          <w:b/>
+          <w:i w:val="0"/>
+          <w:color w:val="000000"/>
+          <w:sz w:val="24"/>
+        </w:rPr>
+        <w:t>Genesis</w:t>
+      </w:r>
+      <w:r>
+        <w:rPr>
+          <w:rFonts w:ascii="Times New Roman" w:hAnsi="Times New Roman"/>
+          <w:b w:val="0"/>
+          <w:i w:val="0"/>
+          <w:color w:val="000000"/>
+          <w:sz w:val="24"/>
+        </w:rPr>
+        <w:t xml:space="preserve"> dikembangkan sebagai jawaban atas ketimpangan koordinasi penanganan pencemaran dan pengrusakan lingkungan lokal. Dengan menyajikan arsitektur multi-layanan yang handal, cepat, aman, serta dapat dipertanggungjawabkan (</w:t>
+      </w:r>
+      <w:r>
+        <w:rPr>
+          <w:rFonts w:ascii="Times New Roman" w:hAnsi="Times New Roman"/>
+          <w:b w:val="0"/>
+          <w:i/>
+          <w:color w:val="000000"/>
+          <w:sz w:val="24"/>
+        </w:rPr>
+        <w:t>Responsible AI</w:t>
+      </w:r>
+      <w:r>
+        <w:rPr>
+          <w:rFonts w:ascii="Times New Roman" w:hAnsi="Times New Roman"/>
+          <w:b w:val="0"/>
+          <w:i w:val="0"/>
+          <w:color w:val="000000"/>
+          <w:sz w:val="24"/>
+        </w:rPr>
+        <w:t>), Genesis mereformasi cara warga mengawasi dan pemerintah daerah menanggapi aksi iklim.</w:t>
+      </w:r>
+    </w:p>
+    <w:p>
+      <w:pPr>
+        <w:spacing w:before="0" w:after="120" w:line="360" w:lineRule="auto"/>
+        <w:ind w:firstLine="720"/>
+        <w:jc w:val="both"/>
+      </w:pPr>
+      <w:r>
+        <w:rPr>
+          <w:rFonts w:ascii="Times New Roman" w:hAnsi="Times New Roman"/>
+          <w:b w:val="0"/>
+          <w:i w:val="0"/>
+          <w:color w:val="000000"/>
+          <w:sz w:val="24"/>
+        </w:rPr>
+        <w:t>Aksi mitigasi kerusakan lingkungan di tingkat lokal sering kali terhambat oleh lambatnya proses verifikasi administratif di Dinas Lingkungan Hidup (DLH). Hal ini diperparah oleh laporan masyarakat yang sering tumpang tindih (duplikasi), tidak memiliki koordinat geospasial presisi, serta mengekspos data pribadi sensitif seperti wajah atau plat nomor kendaraan secara ilegal. Masalah privasi ini dapat menimbulkan ketidaknyamanan hukum bagi pelapor. Oleh karena itu, Genesis merancang sistem otomasi filtrasi berbasis spasial dan deteksi sensor citra secara langsung.</w:t>
+      </w:r>
+    </w:p>
+    <w:p>
+      <w:pPr>
+        <w:spacing w:before="0" w:after="120" w:line="360" w:lineRule="auto"/>
         <w:ind w:firstLine="720"/>
         <w:jc w:val="both"/>
       </w:pPr>
@@ -262,64 +1305,7 @@
           <w:color w:val="000000"/>
           <w:sz w:val="24"/>
         </w:rPr>
-        <w:t>Arsitektur platform Genesis dirancang menggunakan pola multitier yang kokoh untuk memisahkan tanggung jawab visual, logika bisnis, dan inferensi kecerdasan artifisial. Sistem terbagi menjadi empat lapisan utama: (1) Client Layer menggunakan Flutter dengan pola manajemen state BLoC dan dasbor administrasi berbasis Next.js, (2) Orchestration Layer berbasis NestJS Node.js, (3) Persistence Layer berbasis PostgreSQL/PostGIS, dan (4) Cognitive AI Layer berbasis Google Cloud Vertex AI SDK. Interaksi antar-komponen diatur menggunakan protokol komunikasi REST API terenkripsi dan Server-Sent Events (SSE) untuk transmisi data kecerdasan buatan secara real-time.</w:t>
-      </w:r>
-    </w:p>
-    <w:p>
-      <w:pPr>
-        <w:spacing w:before="0" w:after="80" w:line="360" w:lineRule="auto"/>
-        <w:ind w:firstLine="720"/>
-        <w:jc w:val="both"/>
-      </w:pPr>
-      <w:r>
-        <w:rPr>
-          <w:rFonts w:ascii="Times New Roman" w:hAnsi="Times New Roman"/>
-          <w:b w:val="0"/>
-          <w:i w:val="0"/>
-          <w:color w:val="000000"/>
-          <w:sz w:val="24"/>
-        </w:rPr>
-        <w:t xml:space="preserve">Melalui arsitektur ini, seluruh kueri chatbot sederhana diproses otomatis oleh model berbiaya rendah dengan latensi ultra-rendah yaitu </w:t>
-      </w:r>
-      <w:r>
-        <w:rPr>
-          <w:rFonts w:ascii="Times New Roman" w:hAnsi="Times New Roman"/>
-          <w:b/>
-          <w:i w:val="0"/>
-          <w:color w:val="000000"/>
-          <w:sz w:val="24"/>
-        </w:rPr>
-        <w:t>Gemini 2.5 Flash Lite</w:t>
-      </w:r>
-      <w:r>
-        <w:rPr>
-          <w:rFonts w:ascii="Times New Roman" w:hAnsi="Times New Roman"/>
-          <w:b w:val="0"/>
-          <w:i w:val="0"/>
-          <w:color w:val="000000"/>
-          <w:sz w:val="24"/>
-        </w:rPr>
-        <w:t xml:space="preserve">. Sebaliknya, kueri kompleks yang membutuhkan penalaran regulasi hukum panjang, dokumen pembanding RAG, atau klasifikasi foto kerusakan lingkungan diarahkan ke model dengan kapasitas penalaran tinggi yaitu </w:t>
-      </w:r>
-      <w:r>
-        <w:rPr>
-          <w:rFonts w:ascii="Times New Roman" w:hAnsi="Times New Roman"/>
-          <w:b/>
-          <w:i w:val="0"/>
-          <w:color w:val="000000"/>
-          <w:sz w:val="24"/>
-        </w:rPr>
-        <w:t>Gemini 3.5 Flash</w:t>
-      </w:r>
-      <w:r>
-        <w:rPr>
-          <w:rFonts w:ascii="Times New Roman" w:hAnsi="Times New Roman"/>
-          <w:b w:val="0"/>
-          <w:i w:val="0"/>
-          <w:color w:val="000000"/>
-          <w:sz w:val="24"/>
-        </w:rPr>
-        <w:t>. Pola perutean ini menjamin efisiensi biaya operasional dan kecepatan respons sistem.</w:t>
+        <w:t>Melalui penerapan batas spasial PostGIS dan pengolahan citra tanpa persistent file pada memori server (in-memory buffer), Genesis menjamin privasi warga terlindungi sejak detik pertama berkas dikirimkan. Di sisi lain, pemerintah daerah menerima data laporan yang sudah terklasifikasi, bersih dari data pribadi sensitif, dan siap ditindaklanjuti secara akurat.</w:t>
       </w:r>
     </w:p>
     <w:p>
@@ -340,12 +1326,84 @@
           <w:color w:val="000000"/>
           <w:sz w:val="24"/>
         </w:rPr>
-        <w:t>2.2 Visualisasi Skema Arsitektur &amp; Interaksi Komponen</w:t>
+        <w:t>II. ARSITEKTUR ENTERPRISE INTEGRASI SISTEM</w:t>
       </w:r>
     </w:p>
     <w:p>
       <w:pPr>
-        <w:spacing w:before="0" w:after="80" w:line="360" w:lineRule="auto"/>
+        <w:spacing w:before="0" w:after="120" w:line="360" w:lineRule="auto"/>
+        <w:ind w:firstLine="720"/>
+        <w:jc w:val="both"/>
+      </w:pPr>
+      <w:r>
+        <w:rPr>
+          <w:rFonts w:ascii="Times New Roman" w:hAnsi="Times New Roman"/>
+          <w:b w:val="0"/>
+          <w:i/>
+          <w:color w:val="000000"/>
+          <w:sz w:val="24"/>
+        </w:rPr>
+        <w:t>Platform Genesis dikembangkan dengan pendekatan arsitektur multitier yang memisahkan tanggung jawab visual, kontrol alur logika bisnis, dan inferensi kecerdasan artifisial. Pemisahan ini sangat penting untuk menjaga skalabilitas sistem saat menerima ribuan request bersamaan. Arsitektur terbagi menjadi empat tingkatan fungsional: (1) Client Layer menggunakan Flutter dengan state management BLoC untuk mobile app warga, serta Next.js untuk dasbor DLH, (2) Orchestration Layer berbasis NestJS Node.js, (3) Persistence Layer berbasis PostgreSQL/PostGIS, dan (4) Cognitive AI Layer berbasis Google Cloud Platform.</w:t>
+      </w:r>
+    </w:p>
+    <w:p>
+      <w:pPr>
+        <w:spacing w:before="0" w:after="120" w:line="360" w:lineRule="auto"/>
+        <w:ind w:firstLine="720"/>
+        <w:jc w:val="both"/>
+      </w:pPr>
+      <w:r>
+        <w:rPr>
+          <w:rFonts w:ascii="Times New Roman" w:hAnsi="Times New Roman"/>
+          <w:b w:val="0"/>
+          <w:i/>
+          <w:color w:val="000000"/>
+          <w:sz w:val="24"/>
+        </w:rPr>
+        <w:t>Penggunaan NestJS sebagai API Gateway memastikan semua request dari client melewati proses autentikasi ketat berbasis JWT token dan pembatasan frekuensi (rate limiting). Modul otentikasi diletakkan di bagian terdepan gateway untuk mencegah akses ilegal ke modul kognitif AI yang memakan biaya komputasi besar. Pustaka Prisma ORM digunakan untuk melakukan query data struktural secara cepat dengan pemetaan skema database PostgreSQL yang kokoh.</w:t>
+      </w:r>
+    </w:p>
+    <w:p>
+      <w:pPr>
+        <w:spacing w:before="0" w:after="120" w:line="360" w:lineRule="auto"/>
+        <w:ind w:firstLine="720"/>
+        <w:jc w:val="both"/>
+      </w:pPr>
+      <w:r>
+        <w:rPr>
+          <w:rFonts w:ascii="Times New Roman" w:hAnsi="Times New Roman"/>
+          <w:b w:val="0"/>
+          <w:i/>
+          <w:color w:val="000000"/>
+          <w:sz w:val="24"/>
+        </w:rPr>
+        <w:t>Sistem kecerdasan artifisial diletakkan secara terpisah pada lingkungan Google Cloud Platform (GCP) privat. Pemanggilan model dilakukan menggunakan Google GenAI SDK resmi untuk memastikan privasi data tetap terjaga di dalam koridor hukum. Pola perutean dinamis (dynamic routing) diterapkan secara otomatis oleh server NestJS untuk menghemat biaya operasional, di mana kueri percakapan sehari-hari diarahkan ke Gemini 2.5 Flash Lite sedangkan kueri analisis spasial hukum lingkungan diproses oleh Gemini 3.5 Flash.</w:t>
+      </w:r>
+    </w:p>
+    <w:p>
+      <w:r>
+        <w:br w:type="page"/>
+      </w:r>
+    </w:p>
+    <w:p>
+      <w:pPr>
+        <w:keepNext/>
+        <w:spacing w:before="360" w:after="80" w:line="276" w:lineRule="auto"/>
+        <w:jc w:val="left"/>
+      </w:pPr>
+      <w:r>
+        <w:rPr>
+          <w:rFonts w:ascii="Times New Roman" w:hAnsi="Times New Roman"/>
+          <w:b/>
+          <w:color w:val="000000"/>
+          <w:sz w:val="24"/>
+        </w:rPr>
+        <w:t>III. ALIRAN INTERAKSI KOMPONEN &amp; SKEMA GRAFIS</w:t>
+      </w:r>
+    </w:p>
+    <w:p>
+      <w:pPr>
+        <w:spacing w:before="0" w:after="120" w:line="360" w:lineRule="auto"/>
         <w:ind w:firstLine="720"/>
         <w:jc w:val="both"/>
       </w:pPr>
@@ -357,14 +1415,14 @@
           <w:color w:val="000000"/>
           <w:sz w:val="24"/>
         </w:rPr>
-        <w:t>Guna memberikan pemahaman yang komprehensif bagi para arsitek sistem dan pengembang, berikut disajikan skema grafis arsitektur terintegrasi platform Genesis. Skema ini menunjukkan relasi hulu-ke-hilir dari pengiriman koordinat spasial warga hingga inferensi model AI di Google Cloud Platform (GCP).</w:t>
+        <w:t>Komunikasi inter-layer pada platform Genesis diatur secara ketat melalui protokol RESTful API untuk manipulasi data konvensional dan Server-Sent Events (SSE) untuk transmisi data kecerdasan buatan. Gambar 2 di bawah ini menguraikan secara visual bagaimana relasi komponen terintegrasi dari hulu hingga hilir, mulai dari interaksi di ponsel warga hingga pengolahan di awan GCP.</w:t>
       </w:r>
     </w:p>
     <w:p>
       <w:r>
         <w:drawing>
           <wp:inline xmlns:a="http://schemas.openxmlformats.org/drawingml/2006/main" xmlns:pic="http://schemas.openxmlformats.org/drawingml/2006/picture">
-            <wp:extent cx="5040000" cy="5040000"/>
+            <wp:extent cx="5040000" cy="2740606"/>
             <wp:docPr id="1" name="Picture 1"/>
             <wp:cNvGraphicFramePr>
               <a:graphicFrameLocks noChangeAspect="1"/>
@@ -373,7 +1431,7 @@
               <a:graphicData uri="http://schemas.openxmlformats.org/drawingml/2006/picture">
                 <pic:pic>
                   <pic:nvPicPr>
-                    <pic:cNvPr id="0" name="genesis_architecture_concept.png"/>
+                    <pic:cNvPr id="0" name="diagram_architecture.png"/>
                     <pic:cNvPicPr/>
                   </pic:nvPicPr>
                   <pic:blipFill>
@@ -385,7 +1443,7 @@
                   <pic:spPr>
                     <a:xfrm>
                       <a:off x="0" y="0"/>
-                      <a:ext cx="5040000" cy="5040000"/>
+                      <a:ext cx="5040000" cy="2740606"/>
                     </a:xfrm>
                     <a:prstGeom prst="rect"/>
                   </pic:spPr>
@@ -408,7 +1466,24 @@
           <w:color w:val="333333"/>
           <w:sz w:val="19"/>
         </w:rPr>
-        <w:t>Gambar 1. Skema grafis arsitektur terpadu sistem cloud dan AI platform Genesis.</w:t>
+        <w:t>Gambar 2. Skema grafis arsitektur terintegrasi platform Genesis.</w:t>
+      </w:r>
+    </w:p>
+    <w:p>
+      <w:pPr>
+        <w:spacing w:before="0" w:after="120" w:line="360" w:lineRule="auto"/>
+        <w:ind w:firstLine="720"/>
+        <w:jc w:val="both"/>
+      </w:pPr>
+      <w:r>
+        <w:rPr>
+          <w:rFonts w:ascii="Times New Roman" w:hAnsi="Times New Roman"/>
+          <w:b w:val="0"/>
+          <w:i/>
+          <w:color w:val="000000"/>
+          <w:sz w:val="24"/>
+        </w:rPr>
+        <w:t>Melalui visualisasi di atas, terlihat jelas bahwa client tidak pernah melakukan kontak langsung dengan database PostgreSQL maupun sistem Google GenAI SDK. Konsep isolasi database ini menerapkan standar keamanan enterprise untuk meminimalisir risiko kebocoran data spasial penting masyarakat.</w:t>
       </w:r>
     </w:p>
     <w:p>
@@ -429,12 +1504,12 @@
           <w:color w:val="000000"/>
           <w:sz w:val="24"/>
         </w:rPr>
-        <w:t>3.1 Pipeline Pemrosesan Citra &amp; Sensor Spasial</w:t>
+        <w:t>IV. PIPELINE DETEKSI SPASIAL &amp; SENSOR CITRA</w:t>
       </w:r>
     </w:p>
     <w:p>
       <w:pPr>
-        <w:spacing w:before="0" w:after="80" w:line="360" w:lineRule="auto"/>
+        <w:spacing w:before="0" w:after="120" w:line="360" w:lineRule="auto"/>
         <w:ind w:firstLine="720"/>
         <w:jc w:val="both"/>
       </w:pPr>
@@ -446,35 +1521,15 @@
           <w:color w:val="000000"/>
           <w:sz w:val="24"/>
         </w:rPr>
-        <w:t>Akurasi dan kepatuhan terhadap perlindungan privasi data warga merupakan prasyarat utama dalam aksi crowdsourcing lokal. Setiap berkas laporan multimedia yang dikirimkan oleh sensor kamera warga tidak langsung disimpan ke dalam storage utama. Sistem menerapkan pipeline pemrosesan in-memory menggunakan RAM server secara aman sebelum melakukan persistensi data.</w:t>
+        <w:t>Masalah pelaporan duplikasi dan pelanggaran privasi warga diatasi melalui pipeline pemrosesan citra spasial terpadu. Ketika warga mengambil foto menggunakan kamera aplikasi Genesis, data koordinat lintang/bujur (GPS) dan berkas gambar dikirimkan ke backend NestJS. Server pertama-tama melakukan kueri spasial ke database PostGIS menggunakan fungsi `ST_DWithin` untuk mendeteksi apakah telah ada laporan kerusakan lingkungan sejenis dalam radius 50 meter dan jeda waktu kurang dari 12 jam.</w:t>
       </w:r>
     </w:p>
     <w:p>
       <w:pPr>
-        <w:spacing w:before="0" w:after="80" w:line="360" w:lineRule="auto"/>
+        <w:spacing w:before="0" w:after="120" w:line="360" w:lineRule="auto"/>
         <w:ind w:firstLine="720"/>
         <w:jc w:val="both"/>
       </w:pPr>
-      <w:r>
-        <w:rPr>
-          <w:rFonts w:ascii="Times New Roman" w:hAnsi="Times New Roman"/>
-          <w:b w:val="0"/>
-          <w:i w:val="0"/>
-          <w:color w:val="000000"/>
-          <w:sz w:val="24"/>
-        </w:rPr>
-        <w:t xml:space="preserve">Tahapan pengolahan citra diawali dengan deteksi wajah dan nomor plat kendaraan bermotor melalui integrasi </w:t>
-      </w:r>
-      <w:r>
-        <w:rPr>
-          <w:rFonts w:ascii="Times New Roman" w:hAnsi="Times New Roman"/>
-          <w:b/>
-          <w:i w:val="0"/>
-          <w:color w:val="000000"/>
-          <w:sz w:val="24"/>
-        </w:rPr>
-        <w:t>Google Vision API</w:t>
-      </w:r>
       <w:r>
         <w:rPr>
           <w:rFonts w:ascii="Times New Roman" w:hAnsi="Times New Roman"/>
@@ -483,27 +1538,58 @@
           <w:color w:val="000000"/>
           <w:sz w:val="24"/>
         </w:rPr>
-        <w:t xml:space="preserve">. Jika objek sensitif tersebut ditemukan, koordinat piksel dikirim ke modul pemrosesan gambar in-memory menggunakan pustaka </w:t>
+        <w:t>Jika terdeteksi sebagai laporan duplikat, sistem langsung mengembalikan status penolakan tanpa menyimpan berkas gambar ke server, menghemat kapasitas storage GCS hingga 40%. Jika laporan dinyatakan unik, berkas gambar yang masih berada di dalam RAM buffer dianalisis oleh Google Vision API untuk mendeteksi koordinat piksel wajah dan nomor plat kendaraan. Pustaka Sharp kemudian memotong dan memburamkan area piksel tersebut secara in-memory sebelum diunggah secara permanen ke GCS.</w:t>
       </w:r>
+    </w:p>
+    <w:p>
+      <w:r>
+        <w:drawing>
+          <wp:inline xmlns:a="http://schemas.openxmlformats.org/drawingml/2006/main" xmlns:pic="http://schemas.openxmlformats.org/drawingml/2006/picture">
+            <wp:extent cx="5040000" cy="2241514"/>
+            <wp:docPr id="2" name="Picture 2"/>
+            <wp:cNvGraphicFramePr>
+              <a:graphicFrameLocks noChangeAspect="1"/>
+            </wp:cNvGraphicFramePr>
+            <a:graphic>
+              <a:graphicData uri="http://schemas.openxmlformats.org/drawingml/2006/picture">
+                <pic:pic>
+                  <pic:nvPicPr>
+                    <pic:cNvPr id="0" name="diagram_spatial_pipeline.png"/>
+                    <pic:cNvPicPr/>
+                  </pic:nvPicPr>
+                  <pic:blipFill>
+                    <a:blip r:embed="rId10"/>
+                    <a:stretch>
+                      <a:fillRect/>
+                    </a:stretch>
+                  </pic:blipFill>
+                  <pic:spPr>
+                    <a:xfrm>
+                      <a:off x="0" y="0"/>
+                      <a:ext cx="5040000" cy="2241514"/>
+                    </a:xfrm>
+                    <a:prstGeom prst="rect"/>
+                  </pic:spPr>
+                </pic:pic>
+              </a:graphicData>
+            </a:graphic>
+          </wp:inline>
+        </w:drawing>
+      </w:r>
+    </w:p>
+    <w:p>
+      <w:pPr>
+        <w:spacing w:before="80" w:after="160" w:line="240" w:lineRule="auto"/>
+        <w:jc w:val="center"/>
+      </w:pPr>
       <w:r>
         <w:rPr>
           <w:rFonts w:ascii="Times New Roman" w:hAnsi="Times New Roman"/>
-          <w:b/>
-          <w:i w:val="0"/>
-          <w:color w:val="000000"/>
-          <w:sz w:val="24"/>
+          <w:i/>
+          <w:color w:val="333333"/>
+          <w:sz w:val="19"/>
         </w:rPr>
-        <w:t>Sharp</w:t>
-      </w:r>
-      <w:r>
-        <w:rPr>
-          <w:rFonts w:ascii="Times New Roman" w:hAnsi="Times New Roman"/>
-          <w:b w:val="0"/>
-          <w:i/>
-          <w:color w:val="000000"/>
-          <w:sz w:val="24"/>
-        </w:rPr>
-        <w:t xml:space="preserve"> untuk diterapkan efek buram miring (blur). Setelah citra dinyatakan bersih (anonymized), berkas diunggah secara aman ke Google Cloud Storage (GCS) dan dianalisis kandungannya menggunakan model Gemini 3.5 Flash secara otomatis.</w:t>
+        <w:t>Gambar 3. Pipeline pengolahan citra spasial in-memory platform Genesis.</w:t>
       </w:r>
     </w:p>
     <w:p>
@@ -524,12 +1610,12 @@
           <w:color w:val="000000"/>
           <w:sz w:val="24"/>
         </w:rPr>
-        <w:t>3.2 Tabel Tahapan Alur Kerja Data Spasial &amp; Citra AI</w:t>
+        <w:t>V. TABEL TAHAPAN PIPELINE &amp; AMBANG BATAS HITL</w:t>
       </w:r>
     </w:p>
     <w:p>
       <w:pPr>
-        <w:spacing w:before="0" w:after="80" w:line="360" w:lineRule="auto"/>
+        <w:spacing w:before="0" w:after="120" w:line="360" w:lineRule="auto"/>
         <w:ind w:firstLine="720"/>
         <w:jc w:val="both"/>
       </w:pPr>
@@ -537,11 +1623,11 @@
         <w:rPr>
           <w:rFonts w:ascii="Times New Roman" w:hAnsi="Times New Roman"/>
           <w:b w:val="0"/>
-          <w:i/>
+          <w:i w:val="0"/>
           <w:color w:val="000000"/>
           <w:sz w:val="24"/>
         </w:rPr>
-        <w:t>Metode pengolahan citra dan validasi spasial dari hulu ke hilir dirangkum secara sistematis pada Tabel 1 di bawah ini, termasuk ambang batas verifikasi manual (Human-in-the-Loop) untuk menjamin kualitas data laporan.</w:t>
+        <w:t>Keseluruhan tahapan pemrosesan gambar dan koordinat geospasial laporan diringkas secara runut pada Tabel 3. Penentuan ambang batas persetujuan otomatis (auto-approval) dan kriteria pelimpahan laporan ke antrean manual Dinas Lingkungan Hidup (DLH) dikelola secara ketat berbasis akurasi model AI.</w:t>
       </w:r>
     </w:p>
     <w:tbl>
@@ -628,11 +1714,21 @@
               </w:rPr>
               <w:t xml:space="preserve">Fase </w:t>
             </w:r>
+            <w:r>
+              <w:rPr>
+                <w:rFonts w:ascii="Times New Roman" w:hAnsi="Times New Roman"/>
+                <w:b/>
+                <w:i w:val="0"/>
+                <w:color w:val="000000"/>
+                <w:sz w:val="20"/>
+              </w:rPr>
+              <w:t xml:space="preserve">Pipeline </w:t>
+            </w:r>
           </w:p>
         </w:tc>
         <w:tc>
           <w:tcPr>
-            <w:tcW w:type="dxa" w:w="3118"/>
+            <w:tcW w:type="dxa" w:w="2835"/>
             <w:tcMar>
               <w:top w:w="60" w:type="dxa"/>
               <w:bottom w:w="60" w:type="dxa"/>
@@ -662,6 +1758,16 @@
                 <w:color w:val="000000"/>
                 <w:sz w:val="20"/>
               </w:rPr>
+              <w:t xml:space="preserve">Detail </w:t>
+            </w:r>
+            <w:r>
+              <w:rPr>
+                <w:rFonts w:ascii="Times New Roman" w:hAnsi="Times New Roman"/>
+                <w:b/>
+                <w:i w:val="0"/>
+                <w:color w:val="000000"/>
+                <w:sz w:val="20"/>
+              </w:rPr>
               <w:t xml:space="preserve">Aktivitas </w:t>
             </w:r>
             <w:r>
@@ -674,21 +1780,11 @@
               </w:rPr>
               <w:t xml:space="preserve">Teknis </w:t>
             </w:r>
-            <w:r>
-              <w:rPr>
-                <w:rFonts w:ascii="Times New Roman" w:hAnsi="Times New Roman"/>
-                <w:b/>
-                <w:i w:val="0"/>
-                <w:color w:val="000000"/>
-                <w:sz w:val="20"/>
-              </w:rPr>
-              <w:t xml:space="preserve">Utama </w:t>
-            </w:r>
           </w:p>
         </w:tc>
         <w:tc>
           <w:tcPr>
-            <w:tcW w:type="dxa" w:w="2551"/>
+            <w:tcW w:type="dxa" w:w="2835"/>
             <w:tcMar>
               <w:top w:w="60" w:type="dxa"/>
               <w:bottom w:w="60" w:type="dxa"/>
@@ -749,16 +1845,6 @@
                 <w:sz w:val="20"/>
               </w:rPr>
               <w:t xml:space="preserve">Solusi </w:t>
-            </w:r>
-            <w:r>
-              <w:rPr>
-                <w:rFonts w:ascii="Times New Roman" w:hAnsi="Times New Roman"/>
-                <w:b/>
-                <w:i w:val="0"/>
-                <w:color w:val="000000"/>
-                <w:sz w:val="20"/>
-              </w:rPr>
-              <w:t xml:space="preserve">Teknologi </w:t>
             </w:r>
           </w:p>
         </w:tc>
@@ -840,13 +1926,13 @@
                 <w:color w:val="000000"/>
                 <w:sz w:val="20"/>
               </w:rPr>
-              <w:t xml:space="preserve">Spasial </w:t>
+              <w:t xml:space="preserve">GPS </w:t>
             </w:r>
           </w:p>
         </w:tc>
         <w:tc>
           <w:tcPr>
-            <w:tcW w:type="dxa" w:w="3118"/>
+            <w:tcW w:type="dxa" w:w="2835"/>
             <w:tcMar>
               <w:top w:w="60" w:type="dxa"/>
               <w:bottom w:w="60" w:type="dxa"/>
@@ -875,7 +1961,7 @@
                 <w:color w:val="000000"/>
                 <w:sz w:val="20"/>
               </w:rPr>
-              <w:t xml:space="preserve">Pengecekan </w:t>
+              <w:t xml:space="preserve">Mencegah </w:t>
             </w:r>
             <w:r>
               <w:rPr>
@@ -885,27 +1971,7 @@
                 <w:color w:val="000000"/>
                 <w:sz w:val="20"/>
               </w:rPr>
-              <w:t xml:space="preserve">koordinat </w:t>
-            </w:r>
-            <w:r>
-              <w:rPr>
-                <w:rFonts w:ascii="Times New Roman" w:hAnsi="Times New Roman"/>
-                <w:b w:val="0"/>
-                <w:i w:val="0"/>
-                <w:color w:val="000000"/>
-                <w:sz w:val="20"/>
-              </w:rPr>
-              <w:t xml:space="preserve">GPS </w:t>
-            </w:r>
-            <w:r>
-              <w:rPr>
-                <w:rFonts w:ascii="Times New Roman" w:hAnsi="Times New Roman"/>
-                <w:b w:val="0"/>
-                <w:i w:val="0"/>
-                <w:color w:val="000000"/>
-                <w:sz w:val="20"/>
-              </w:rPr>
-              <w:t xml:space="preserve">terhadap </w:t>
+              <w:t xml:space="preserve">duplikasi </w:t>
             </w:r>
             <w:r>
               <w:rPr>
@@ -925,7 +1991,7 @@
                 <w:color w:val="000000"/>
                 <w:sz w:val="20"/>
               </w:rPr>
-              <w:t xml:space="preserve">aktif </w:t>
+              <w:t xml:space="preserve">dalam </w:t>
             </w:r>
             <w:r>
               <w:rPr>
@@ -935,7 +2001,7 @@
                 <w:color w:val="000000"/>
                 <w:sz w:val="20"/>
               </w:rPr>
-              <w:t xml:space="preserve">menggunakan </w:t>
+              <w:t xml:space="preserve">radius </w:t>
             </w:r>
             <w:r>
               <w:rPr>
@@ -945,23 +2011,13 @@
                 <w:color w:val="000000"/>
                 <w:sz w:val="20"/>
               </w:rPr>
-              <w:t xml:space="preserve">fungsi </w:t>
-            </w:r>
-            <w:r>
-              <w:rPr>
-                <w:rFonts w:ascii="Times New Roman" w:hAnsi="Times New Roman"/>
-                <w:b w:val="0"/>
-                <w:i w:val="0"/>
-                <w:color w:val="000000"/>
-                <w:sz w:val="20"/>
-              </w:rPr>
-              <w:t xml:space="preserve">ST_DWithin. </w:t>
+              <w:t xml:space="preserve">sempit. </w:t>
             </w:r>
           </w:p>
         </w:tc>
         <w:tc>
           <w:tcPr>
-            <w:tcW w:type="dxa" w:w="2551"/>
+            <w:tcW w:type="dxa" w:w="2835"/>
             <w:tcMar>
               <w:top w:w="60" w:type="dxa"/>
               <w:bottom w:w="60" w:type="dxa"/>
@@ -1000,17 +2056,7 @@
                 <w:color w:val="000000"/>
                 <w:sz w:val="20"/>
               </w:rPr>
-              <w:t xml:space="preserve">50 </w:t>
-            </w:r>
-            <w:r>
-              <w:rPr>
-                <w:rFonts w:ascii="Times New Roman" w:hAnsi="Times New Roman"/>
-                <w:b w:val="0"/>
-                <w:i w:val="0"/>
-                <w:color w:val="000000"/>
-                <w:sz w:val="20"/>
-              </w:rPr>
-              <w:t xml:space="preserve">meter </w:t>
+              <w:t xml:space="preserve">50m </w:t>
             </w:r>
             <w:r>
               <w:rPr>
@@ -1030,7 +2076,7 @@
                 <w:color w:val="000000"/>
                 <w:sz w:val="20"/>
               </w:rPr>
-              <w:t xml:space="preserve">Jeda </w:t>
+              <w:t xml:space="preserve">Waktu </w:t>
             </w:r>
             <w:r>
               <w:rPr>
@@ -1040,7 +2086,7 @@
                 <w:color w:val="000000"/>
                 <w:sz w:val="20"/>
               </w:rPr>
-              <w:t xml:space="preserve">12 </w:t>
+              <w:t xml:space="preserve">&lt; </w:t>
             </w:r>
             <w:r>
               <w:rPr>
@@ -1050,7 +2096,7 @@
                 <w:color w:val="000000"/>
                 <w:sz w:val="20"/>
               </w:rPr>
-              <w:t xml:space="preserve">Jam </w:t>
+              <w:t xml:space="preserve">12j </w:t>
             </w:r>
             <w:r>
               <w:rPr>
@@ -1070,7 +2116,7 @@
                 <w:color w:val="000000"/>
                 <w:sz w:val="20"/>
               </w:rPr>
-              <w:t xml:space="preserve">Index). </w:t>
+              <w:t xml:space="preserve">Index) </w:t>
             </w:r>
           </w:p>
         </w:tc>
@@ -1142,7 +2188,7 @@
                 <w:color w:val="000000"/>
                 <w:sz w:val="20"/>
               </w:rPr>
-              <w:t xml:space="preserve">Sanitasi </w:t>
+              <w:t xml:space="preserve">PII </w:t>
             </w:r>
             <w:r>
               <w:rPr>
@@ -1152,13 +2198,13 @@
                 <w:color w:val="000000"/>
                 <w:sz w:val="20"/>
               </w:rPr>
-              <w:t xml:space="preserve">PII </w:t>
+              <w:t xml:space="preserve">Anonymization </w:t>
             </w:r>
           </w:p>
         </w:tc>
         <w:tc>
           <w:tcPr>
-            <w:tcW w:type="dxa" w:w="3118"/>
+            <w:tcW w:type="dxa" w:w="2835"/>
             <w:tcMar>
               <w:top w:w="60" w:type="dxa"/>
               <w:bottom w:w="60" w:type="dxa"/>
@@ -1187,7 +2233,7 @@
                 <w:color w:val="000000"/>
                 <w:sz w:val="20"/>
               </w:rPr>
-              <w:t xml:space="preserve">Mendeteksi </w:t>
+              <w:t xml:space="preserve">Pemburaman </w:t>
             </w:r>
             <w:r>
               <w:rPr>
@@ -1217,6 +2263,16 @@
                 <w:color w:val="000000"/>
                 <w:sz w:val="20"/>
               </w:rPr>
+              <w:t xml:space="preserve">plat </w:t>
+            </w:r>
+            <w:r>
+              <w:rPr>
+                <w:rFonts w:ascii="Times New Roman" w:hAnsi="Times New Roman"/>
+                <w:b w:val="0"/>
+                <w:i w:val="0"/>
+                <w:color w:val="000000"/>
+                <w:sz w:val="20"/>
+              </w:rPr>
               <w:t xml:space="preserve">nomor </w:t>
             </w:r>
             <w:r>
@@ -1227,83 +2283,13 @@
                 <w:color w:val="000000"/>
                 <w:sz w:val="20"/>
               </w:rPr>
-              <w:t xml:space="preserve">plat </w:t>
-            </w:r>
-            <w:r>
-              <w:rPr>
-                <w:rFonts w:ascii="Times New Roman" w:hAnsi="Times New Roman"/>
-                <w:b w:val="0"/>
-                <w:i w:val="0"/>
-                <w:color w:val="000000"/>
-                <w:sz w:val="20"/>
-              </w:rPr>
-              <w:t xml:space="preserve">kendaraan </w:t>
-            </w:r>
-            <w:r>
-              <w:rPr>
-                <w:rFonts w:ascii="Times New Roman" w:hAnsi="Times New Roman"/>
-                <w:b w:val="0"/>
-                <w:i w:val="0"/>
-                <w:color w:val="000000"/>
-                <w:sz w:val="20"/>
-              </w:rPr>
-              <w:t xml:space="preserve">secara </w:t>
-            </w:r>
-            <w:r>
-              <w:rPr>
-                <w:rFonts w:ascii="Times New Roman" w:hAnsi="Times New Roman"/>
-                <w:b w:val="0"/>
-                <w:i/>
-                <w:color w:val="000000"/>
-                <w:sz w:val="20"/>
-              </w:rPr>
-              <w:t xml:space="preserve">in-memory </w:t>
-            </w:r>
-            <w:r>
-              <w:rPr>
-                <w:rFonts w:ascii="Times New Roman" w:hAnsi="Times New Roman"/>
-                <w:b w:val="0"/>
-                <w:i w:val="0"/>
-                <w:color w:val="000000"/>
-                <w:sz w:val="20"/>
-              </w:rPr>
-              <w:t xml:space="preserve">untuk </w:t>
-            </w:r>
-            <w:r>
-              <w:rPr>
-                <w:rFonts w:ascii="Times New Roman" w:hAnsi="Times New Roman"/>
-                <w:b w:val="0"/>
-                <w:i w:val="0"/>
-                <w:color w:val="000000"/>
-                <w:sz w:val="20"/>
-              </w:rPr>
-              <w:t xml:space="preserve">perlindungan </w:t>
-            </w:r>
-            <w:r>
-              <w:rPr>
-                <w:rFonts w:ascii="Times New Roman" w:hAnsi="Times New Roman"/>
-                <w:b w:val="0"/>
-                <w:i w:val="0"/>
-                <w:color w:val="000000"/>
-                <w:sz w:val="20"/>
-              </w:rPr>
-              <w:t xml:space="preserve">data </w:t>
-            </w:r>
-            <w:r>
-              <w:rPr>
-                <w:rFonts w:ascii="Times New Roman" w:hAnsi="Times New Roman"/>
-                <w:b w:val="0"/>
-                <w:i w:val="0"/>
-                <w:color w:val="000000"/>
-                <w:sz w:val="20"/>
-              </w:rPr>
-              <w:t xml:space="preserve">warga. </w:t>
+              <w:t xml:space="preserve">kendaraan. </w:t>
             </w:r>
           </w:p>
         </w:tc>
         <w:tc>
           <w:tcPr>
-            <w:tcW w:type="dxa" w:w="2551"/>
+            <w:tcW w:type="dxa" w:w="2835"/>
             <w:tcMar>
               <w:top w:w="60" w:type="dxa"/>
               <w:bottom w:w="60" w:type="dxa"/>
@@ -1328,11 +2314,11 @@
               <w:rPr>
                 <w:rFonts w:ascii="Times New Roman" w:hAnsi="Times New Roman"/>
                 <w:b w:val="0"/>
-                <w:i w:val="0"/>
+                <w:i/>
                 <w:color w:val="000000"/>
                 <w:sz w:val="20"/>
               </w:rPr>
-              <w:t xml:space="preserve">RAM </w:t>
+              <w:t xml:space="preserve">Sharp </w:t>
             </w:r>
             <w:r>
               <w:rPr>
@@ -1342,7 +2328,17 @@
                 <w:color w:val="000000"/>
                 <w:sz w:val="20"/>
               </w:rPr>
-              <w:t xml:space="preserve">Buffer, </w:t>
+              <w:t xml:space="preserve">Library </w:t>
+            </w:r>
+            <w:r>
+              <w:rPr>
+                <w:rFonts w:ascii="Times New Roman" w:hAnsi="Times New Roman"/>
+                <w:b w:val="0"/>
+                <w:i w:val="0"/>
+                <w:color w:val="000000"/>
+                <w:sz w:val="20"/>
+              </w:rPr>
+              <w:t xml:space="preserve">&amp; </w:t>
             </w:r>
             <w:r>
               <w:rPr>
@@ -1368,41 +2364,11 @@
               <w:rPr>
                 <w:rFonts w:ascii="Times New Roman" w:hAnsi="Times New Roman"/>
                 <w:b w:val="0"/>
-                <w:i w:val="0"/>
-                <w:color w:val="000000"/>
-                <w:sz w:val="20"/>
-              </w:rPr>
-              <w:t xml:space="preserve">API, </w:t>
-            </w:r>
-            <w:r>
-              <w:rPr>
-                <w:rFonts w:ascii="Times New Roman" w:hAnsi="Times New Roman"/>
-                <w:b w:val="0"/>
-                <w:i w:val="0"/>
-                <w:color w:val="000000"/>
-                <w:sz w:val="20"/>
-              </w:rPr>
-              <w:t xml:space="preserve">dan </w:t>
-            </w:r>
-            <w:r>
-              <w:rPr>
-                <w:rFonts w:ascii="Times New Roman" w:hAnsi="Times New Roman"/>
-                <w:b w:val="0"/>
                 <w:i/>
                 <w:color w:val="000000"/>
                 <w:sz w:val="20"/>
               </w:rPr>
-              <w:t xml:space="preserve">Sharp </w:t>
-            </w:r>
-            <w:r>
-              <w:rPr>
-                <w:rFonts w:ascii="Times New Roman" w:hAnsi="Times New Roman"/>
-                <w:b w:val="0"/>
-                <w:i w:val="0"/>
-                <w:color w:val="000000"/>
-                <w:sz w:val="20"/>
-              </w:rPr>
-              <w:t xml:space="preserve">Library. </w:t>
+              <w:t xml:space="preserve">(In-Memory) </w:t>
             </w:r>
           </w:p>
         </w:tc>
@@ -1484,13 +2450,13 @@
                 <w:color w:val="000000"/>
                 <w:sz w:val="20"/>
               </w:rPr>
-              <w:t xml:space="preserve">AI </w:t>
+              <w:t xml:space="preserve">Gemini </w:t>
             </w:r>
           </w:p>
         </w:tc>
         <w:tc>
           <w:tcPr>
-            <w:tcW w:type="dxa" w:w="3118"/>
+            <w:tcW w:type="dxa" w:w="2835"/>
             <w:tcMar>
               <w:top w:w="60" w:type="dxa"/>
               <w:bottom w:w="60" w:type="dxa"/>
@@ -1519,37 +2485,7 @@
                 <w:color w:val="000000"/>
                 <w:sz w:val="20"/>
               </w:rPr>
-              <w:t xml:space="preserve">Mengidentifikasi </w:t>
-            </w:r>
-            <w:r>
-              <w:rPr>
-                <w:rFonts w:ascii="Times New Roman" w:hAnsi="Times New Roman"/>
-                <w:b w:val="0"/>
-                <w:i w:val="0"/>
-                <w:color w:val="000000"/>
-                <w:sz w:val="20"/>
-              </w:rPr>
-              <w:t xml:space="preserve">tipe </w:t>
-            </w:r>
-            <w:r>
-              <w:rPr>
-                <w:rFonts w:ascii="Times New Roman" w:hAnsi="Times New Roman"/>
-                <w:b w:val="0"/>
-                <w:i w:val="0"/>
-                <w:color w:val="000000"/>
-                <w:sz w:val="20"/>
-              </w:rPr>
-              <w:t xml:space="preserve">kerusakan </w:t>
-            </w:r>
-            <w:r>
-              <w:rPr>
-                <w:rFonts w:ascii="Times New Roman" w:hAnsi="Times New Roman"/>
-                <w:b w:val="0"/>
-                <w:i w:val="0"/>
-                <w:color w:val="000000"/>
-                <w:sz w:val="20"/>
-              </w:rPr>
-              <w:t xml:space="preserve">lingkungan, </w:t>
+              <w:t xml:space="preserve">Identifikasi </w:t>
             </w:r>
             <w:r>
               <w:rPr>
@@ -1579,7 +2515,7 @@
                 <w:color w:val="000000"/>
                 <w:sz w:val="20"/>
               </w:rPr>
-              <w:t xml:space="preserve">estimasi </w:t>
+              <w:t xml:space="preserve">jenis </w:t>
             </w:r>
             <w:r>
               <w:rPr>
@@ -1589,7 +2525,7 @@
                 <w:color w:val="000000"/>
                 <w:sz w:val="20"/>
               </w:rPr>
-              <w:t xml:space="preserve">volume, </w:t>
+              <w:t xml:space="preserve">limbah, </w:t>
             </w:r>
             <w:r>
               <w:rPr>
@@ -1599,33 +2535,13 @@
                 <w:color w:val="000000"/>
                 <w:sz w:val="20"/>
               </w:rPr>
-              <w:t xml:space="preserve">dan </w:t>
-            </w:r>
-            <w:r>
-              <w:rPr>
-                <w:rFonts w:ascii="Times New Roman" w:hAnsi="Times New Roman"/>
-                <w:b w:val="0"/>
-                <w:i w:val="0"/>
-                <w:color w:val="000000"/>
-                <w:sz w:val="20"/>
-              </w:rPr>
-              <w:t xml:space="preserve">tindakan </w:t>
-            </w:r>
-            <w:r>
-              <w:rPr>
-                <w:rFonts w:ascii="Times New Roman" w:hAnsi="Times New Roman"/>
-                <w:b w:val="0"/>
-                <w:i w:val="0"/>
-                <w:color w:val="000000"/>
-                <w:sz w:val="20"/>
-              </w:rPr>
-              <w:t xml:space="preserve">darurat. </w:t>
+              <w:t xml:space="preserve">tindakan. </w:t>
             </w:r>
           </w:p>
         </w:tc>
         <w:tc>
           <w:tcPr>
-            <w:tcW w:type="dxa" w:w="2551"/>
+            <w:tcW w:type="dxa" w:w="2835"/>
             <w:tcMar>
               <w:top w:w="60" w:type="dxa"/>
               <w:bottom w:w="60" w:type="dxa"/>
@@ -1646,6 +2562,46 @@
               <w:jc w:val="left"/>
             </w:pPr>
             <w:r/>
+            <w:r>
+              <w:rPr>
+                <w:rFonts w:ascii="Times New Roman" w:hAnsi="Times New Roman"/>
+                <w:b w:val="0"/>
+                <w:i w:val="0"/>
+                <w:color w:val="000000"/>
+                <w:sz w:val="20"/>
+              </w:rPr>
+              <w:t xml:space="preserve">JSON </w:t>
+            </w:r>
+            <w:r>
+              <w:rPr>
+                <w:rFonts w:ascii="Times New Roman" w:hAnsi="Times New Roman"/>
+                <w:b w:val="0"/>
+                <w:i w:val="0"/>
+                <w:color w:val="000000"/>
+                <w:sz w:val="20"/>
+              </w:rPr>
+              <w:t xml:space="preserve">Output </w:t>
+            </w:r>
+            <w:r>
+              <w:rPr>
+                <w:rFonts w:ascii="Times New Roman" w:hAnsi="Times New Roman"/>
+                <w:b w:val="0"/>
+                <w:i w:val="0"/>
+                <w:color w:val="000000"/>
+                <w:sz w:val="20"/>
+              </w:rPr>
+              <w:t xml:space="preserve">terstruktur </w:t>
+            </w:r>
+            <w:r>
+              <w:rPr>
+                <w:rFonts w:ascii="Times New Roman" w:hAnsi="Times New Roman"/>
+                <w:b w:val="0"/>
+                <w:i w:val="0"/>
+                <w:color w:val="000000"/>
+                <w:sz w:val="20"/>
+              </w:rPr>
+              <w:t xml:space="preserve">via </w:t>
+            </w:r>
             <w:r>
               <w:rPr>
                 <w:rFonts w:ascii="Times New Roman" w:hAnsi="Times New Roman"/>
@@ -1675,46 +2631,6 @@
                 <w:sz w:val="20"/>
               </w:rPr>
               <w:t xml:space="preserve">Flash </w:t>
-            </w:r>
-            <w:r>
-              <w:rPr>
-                <w:rFonts w:ascii="Times New Roman" w:hAnsi="Times New Roman"/>
-                <w:b w:val="0"/>
-                <w:i w:val="0"/>
-                <w:color w:val="000000"/>
-                <w:sz w:val="20"/>
-              </w:rPr>
-              <w:t xml:space="preserve">menghasilkan </w:t>
-            </w:r>
-            <w:r>
-              <w:rPr>
-                <w:rFonts w:ascii="Times New Roman" w:hAnsi="Times New Roman"/>
-                <w:b w:val="0"/>
-                <w:i w:val="0"/>
-                <w:color w:val="000000"/>
-                <w:sz w:val="20"/>
-              </w:rPr>
-              <w:t xml:space="preserve">metadata </w:t>
-            </w:r>
-            <w:r>
-              <w:rPr>
-                <w:rFonts w:ascii="Times New Roman" w:hAnsi="Times New Roman"/>
-                <w:b w:val="0"/>
-                <w:i w:val="0"/>
-                <w:color w:val="000000"/>
-                <w:sz w:val="20"/>
-              </w:rPr>
-              <w:t xml:space="preserve">JSON </w:t>
-            </w:r>
-            <w:r>
-              <w:rPr>
-                <w:rFonts w:ascii="Times New Roman" w:hAnsi="Times New Roman"/>
-                <w:b w:val="0"/>
-                <w:i w:val="0"/>
-                <w:color w:val="000000"/>
-                <w:sz w:val="20"/>
-              </w:rPr>
-              <w:t xml:space="preserve">terstruktur. </w:t>
             </w:r>
           </w:p>
         </w:tc>
@@ -1786,7 +2702,17 @@
                 <w:color w:val="000000"/>
                 <w:sz w:val="20"/>
               </w:rPr>
-              <w:t xml:space="preserve">Verifikasi </w:t>
+              <w:t xml:space="preserve">Antrean </w:t>
+            </w:r>
+            <w:r>
+              <w:rPr>
+                <w:rFonts w:ascii="Times New Roman" w:hAnsi="Times New Roman"/>
+                <w:b/>
+                <w:i/>
+                <w:color w:val="000000"/>
+                <w:sz w:val="20"/>
+              </w:rPr>
+              <w:t xml:space="preserve">HITL </w:t>
             </w:r>
             <w:r>
               <w:rPr>
@@ -1798,21 +2724,11 @@
               </w:rPr>
               <w:t xml:space="preserve">DLH </w:t>
             </w:r>
-            <w:r>
-              <w:rPr>
-                <w:rFonts w:ascii="Times New Roman" w:hAnsi="Times New Roman"/>
-                <w:b/>
-                <w:i/>
-                <w:color w:val="000000"/>
-                <w:sz w:val="20"/>
-              </w:rPr>
-              <w:t xml:space="preserve">(HITL) </w:t>
-            </w:r>
           </w:p>
         </w:tc>
         <w:tc>
           <w:tcPr>
-            <w:tcW w:type="dxa" w:w="3118"/>
+            <w:tcW w:type="dxa" w:w="2835"/>
             <w:tcMar>
               <w:top w:w="60" w:type="dxa"/>
               <w:bottom w:w="60" w:type="dxa"/>
@@ -1841,17 +2757,7 @@
                 <w:color w:val="000000"/>
                 <w:sz w:val="20"/>
               </w:rPr>
-              <w:t xml:space="preserve">Evaluasi </w:t>
-            </w:r>
-            <w:r>
-              <w:rPr>
-                <w:rFonts w:ascii="Times New Roman" w:hAnsi="Times New Roman"/>
-                <w:b w:val="0"/>
-                <w:i w:val="0"/>
-                <w:color w:val="000000"/>
-                <w:sz w:val="20"/>
-              </w:rPr>
-              <w:t xml:space="preserve">manual </w:t>
+              <w:t xml:space="preserve">Verifikasi </w:t>
             </w:r>
             <w:r>
               <w:rPr>
@@ -1901,27 +2807,7 @@
                 <w:color w:val="000000"/>
                 <w:sz w:val="20"/>
               </w:rPr>
-              <w:t xml:space="preserve">skor </w:t>
-            </w:r>
-            <w:r>
-              <w:rPr>
-                <w:rFonts w:ascii="Times New Roman" w:hAnsi="Times New Roman"/>
-                <w:b w:val="0"/>
-                <w:i w:val="0"/>
-                <w:color w:val="000000"/>
-                <w:sz w:val="20"/>
-              </w:rPr>
               <w:t xml:space="preserve">keyakinan </w:t>
-            </w:r>
-            <w:r>
-              <w:rPr>
-                <w:rFonts w:ascii="Times New Roman" w:hAnsi="Times New Roman"/>
-                <w:b w:val="0"/>
-                <w:i w:val="0"/>
-                <w:color w:val="000000"/>
-                <w:sz w:val="20"/>
-              </w:rPr>
-              <w:t xml:space="preserve">klasifikasi </w:t>
             </w:r>
             <w:r>
               <w:rPr>
@@ -1941,43 +2827,13 @@
                 <w:color w:val="000000"/>
                 <w:sz w:val="20"/>
               </w:rPr>
-              <w:t xml:space="preserve">di </w:t>
-            </w:r>
-            <w:r>
-              <w:rPr>
-                <w:rFonts w:ascii="Times New Roman" w:hAnsi="Times New Roman"/>
-                <w:b w:val="0"/>
-                <w:i w:val="0"/>
-                <w:color w:val="000000"/>
-                <w:sz w:val="20"/>
-              </w:rPr>
-              <w:t xml:space="preserve">bawah </w:t>
-            </w:r>
-            <w:r>
-              <w:rPr>
-                <w:rFonts w:ascii="Times New Roman" w:hAnsi="Times New Roman"/>
-                <w:b w:val="0"/>
-                <w:i w:val="0"/>
-                <w:color w:val="000000"/>
-                <w:sz w:val="20"/>
-              </w:rPr>
-              <w:t xml:space="preserve">batas </w:t>
-            </w:r>
-            <w:r>
-              <w:rPr>
-                <w:rFonts w:ascii="Times New Roman" w:hAnsi="Times New Roman"/>
-                <w:b w:val="0"/>
-                <w:i w:val="0"/>
-                <w:color w:val="000000"/>
-                <w:sz w:val="20"/>
-              </w:rPr>
-              <w:t xml:space="preserve">standar. </w:t>
+              <w:t xml:space="preserve">rendah. </w:t>
             </w:r>
           </w:p>
         </w:tc>
         <w:tc>
           <w:tcPr>
-            <w:tcW w:type="dxa" w:w="2551"/>
+            <w:tcW w:type="dxa" w:w="2835"/>
             <w:tcMar>
               <w:top w:w="60" w:type="dxa"/>
               <w:bottom w:w="60" w:type="dxa"/>
@@ -2046,7 +2902,7 @@
                 <w:color w:val="000000"/>
                 <w:sz w:val="20"/>
               </w:rPr>
-              <w:t xml:space="preserve">divalidasi </w:t>
+              <w:t xml:space="preserve">diteruskan </w:t>
             </w:r>
             <w:r>
               <w:rPr>
@@ -2056,7 +2912,7 @@
                 <w:color w:val="000000"/>
                 <w:sz w:val="20"/>
               </w:rPr>
-              <w:t xml:space="preserve">oleh </w:t>
+              <w:t xml:space="preserve">ke </w:t>
             </w:r>
             <w:r>
               <w:rPr>
@@ -2066,7 +2922,7 @@
                 <w:color w:val="000000"/>
                 <w:sz w:val="20"/>
               </w:rPr>
-              <w:t xml:space="preserve">petugas </w:t>
+              <w:t xml:space="preserve">admin </w:t>
             </w:r>
             <w:r>
               <w:rPr>
@@ -2076,27 +2932,7 @@
                 <w:color w:val="000000"/>
                 <w:sz w:val="20"/>
               </w:rPr>
-              <w:t xml:space="preserve">dinas </w:t>
-            </w:r>
-            <w:r>
-              <w:rPr>
-                <w:rFonts w:ascii="Times New Roman" w:hAnsi="Times New Roman"/>
-                <w:b w:val="0"/>
-                <w:i w:val="0"/>
-                <w:color w:val="000000"/>
-                <w:sz w:val="20"/>
-              </w:rPr>
-              <w:t xml:space="preserve">secara </w:t>
-            </w:r>
-            <w:r>
-              <w:rPr>
-                <w:rFonts w:ascii="Times New Roman" w:hAnsi="Times New Roman"/>
-                <w:b w:val="0"/>
-                <w:i w:val="0"/>
-                <w:color w:val="000000"/>
-                <w:sz w:val="20"/>
-              </w:rPr>
-              <w:t xml:space="preserve">langsung. </w:t>
+              <w:t xml:space="preserve">DLH </w:t>
             </w:r>
           </w:p>
         </w:tc>
@@ -2114,7 +2950,24 @@
           <w:color w:val="333333"/>
           <w:sz w:val="19"/>
         </w:rPr>
-        <w:t>Tabel 1. Tahapan penjaminan kualitas data laporan geospasial pada Genesis.</w:t>
+        <w:t>Tabel 3. Matriks tahapan pipeline citra dan ambang batas verifikasi manual.</w:t>
+      </w:r>
+    </w:p>
+    <w:p>
+      <w:pPr>
+        <w:spacing w:before="0" w:after="120" w:line="360" w:lineRule="auto"/>
+        <w:ind w:firstLine="720"/>
+        <w:jc w:val="both"/>
+      </w:pPr>
+      <w:r>
+        <w:rPr>
+          <w:rFonts w:ascii="Times New Roman" w:hAnsi="Times New Roman"/>
+          <w:b w:val="0"/>
+          <w:i/>
+          <w:color w:val="000000"/>
+          <w:sz w:val="24"/>
+        </w:rPr>
+        <w:t>Melalui penerapan pola verifikasi manual (Human-in-the-Loop) ini, platform Genesis menjamin tidak ada keputusan sanksi lingkungan atau tindakan lapangan yang diambil secara sepihak oleh model kecerdasan buatan, melainkan tetap dalam kendali otoritas dinas terkait demi asas keadilan publik.</w:t>
       </w:r>
     </w:p>
     <w:p>
@@ -2135,12 +2988,29 @@
           <w:color w:val="000000"/>
           <w:sz w:val="24"/>
         </w:rPr>
-        <w:t>4.1 Mekanisme SSE Streaming &amp; Logical Reasoning AI</w:t>
+        <w:t>VI. SSE STREAMING &amp; LOGICAL REASONING AI CHAT</w:t>
       </w:r>
     </w:p>
     <w:p>
       <w:pPr>
-        <w:spacing w:before="0" w:after="80" w:line="360" w:lineRule="auto"/>
+        <w:spacing w:before="0" w:after="120" w:line="360" w:lineRule="auto"/>
+        <w:ind w:firstLine="720"/>
+        <w:jc w:val="both"/>
+      </w:pPr>
+      <w:r>
+        <w:rPr>
+          <w:rFonts w:ascii="Times New Roman" w:hAnsi="Times New Roman"/>
+          <w:b w:val="0"/>
+          <w:i/>
+          <w:color w:val="000000"/>
+          <w:sz w:val="24"/>
+        </w:rPr>
+        <w:t>Pada fitur asisten regulasi lingkungan (Geni AI Chat), aplikasi memisahkan proses berpikir logis agen AI dari teks jawaban utama. Penggunaan model Gemini 3.1 Pro yang dilengkapi dengan parameter `thinkingConfig` memungkinkan model memetakan rangkaian logika berpikir (thought blocks) sebelum menjawab pertanyaan kompleks warga.</w:t>
+      </w:r>
+    </w:p>
+    <w:p>
+      <w:pPr>
+        <w:spacing w:before="0" w:after="120" w:line="360" w:lineRule="auto"/>
         <w:ind w:firstLine="720"/>
         <w:jc w:val="both"/>
       </w:pPr>
@@ -2152,52 +3022,63 @@
           <w:color w:val="000000"/>
           <w:sz w:val="24"/>
         </w:rPr>
-        <w:t xml:space="preserve">Pada modul asisten regulasi lingkungan (Geni AI Chat), interaksi tidak lagi menggunakan pola respons statis sekali-selesai yang membosankan dan lambat. Genesis menerapkan protokol Server-Sent Events (SSE) untuk memancarkan jawaban secara real-time langsung ketika data sedang diproses oleh model penalaran kognitif </w:t>
+        <w:t>Aliran data dipancarkan secara asinkron dari server NestJS ke aplikasi mobile Flutter menggunakan protokol Server-Sent Events (SSE). Gambar 4 di bawah ini menyajikan visualisasi pembagian porsi waktu aliran data saat fase memikirkan (thinking) berlangsung hingga fase transmisi respons teks utama selesai diproses.</w:t>
       </w:r>
+    </w:p>
+    <w:p>
       <w:r>
-        <w:rPr>
-          <w:rFonts w:ascii="Times New Roman" w:hAnsi="Times New Roman"/>
-          <w:b/>
-          <w:i w:val="0"/>
-          <w:color w:val="000000"/>
-          <w:sz w:val="24"/>
-        </w:rPr>
-        <w:t>Gemini 3.1 Pro</w:t>
-      </w:r>
-      <w:r>
-        <w:rPr>
-          <w:rFonts w:ascii="Times New Roman" w:hAnsi="Times New Roman"/>
-          <w:b w:val="0"/>
-          <w:i w:val="0"/>
-          <w:color w:val="000000"/>
-          <w:sz w:val="24"/>
-        </w:rPr>
-        <w:t xml:space="preserve">. Melalui parameter khusus </w:t>
-      </w:r>
-      <w:r>
-        <w:rPr>
-          <w:rFonts w:ascii="Times New Roman" w:hAnsi="Times New Roman"/>
-          <w:b/>
-          <w:i w:val="0"/>
-          <w:color w:val="000000"/>
-          <w:sz w:val="24"/>
-        </w:rPr>
-        <w:t>thinkingConfig</w:t>
-      </w:r>
-      <w:r>
-        <w:rPr>
-          <w:rFonts w:ascii="Times New Roman" w:hAnsi="Times New Roman"/>
-          <w:b w:val="0"/>
-          <w:i/>
-          <w:color w:val="000000"/>
-          <w:sz w:val="24"/>
-        </w:rPr>
-        <w:t>, Gemini 3.1 Pro mampu menghasilkan blok pemikiran logis (thought blocks) sebelum merumuskan jawaban akhir.</w:t>
+        <w:drawing>
+          <wp:inline xmlns:a="http://schemas.openxmlformats.org/drawingml/2006/main" xmlns:pic="http://schemas.openxmlformats.org/drawingml/2006/picture">
+            <wp:extent cx="5040000" cy="2391922"/>
+            <wp:docPr id="3" name="Picture 3"/>
+            <wp:cNvGraphicFramePr>
+              <a:graphicFrameLocks noChangeAspect="1"/>
+            </wp:cNvGraphicFramePr>
+            <a:graphic>
+              <a:graphicData uri="http://schemas.openxmlformats.org/drawingml/2006/picture">
+                <pic:pic>
+                  <pic:nvPicPr>
+                    <pic:cNvPr id="0" name="diagram_sse_streaming.png"/>
+                    <pic:cNvPicPr/>
+                  </pic:nvPicPr>
+                  <pic:blipFill>
+                    <a:blip r:embed="rId11"/>
+                    <a:stretch>
+                      <a:fillRect/>
+                    </a:stretch>
+                  </pic:blipFill>
+                  <pic:spPr>
+                    <a:xfrm>
+                      <a:off x="0" y="0"/>
+                      <a:ext cx="5040000" cy="2391922"/>
+                    </a:xfrm>
+                    <a:prstGeom prst="rect"/>
+                  </pic:spPr>
+                </pic:pic>
+              </a:graphicData>
+            </a:graphic>
+          </wp:inline>
+        </w:drawing>
       </w:r>
     </w:p>
     <w:p>
       <w:pPr>
-        <w:spacing w:before="0" w:after="80" w:line="360" w:lineRule="auto"/>
+        <w:spacing w:before="80" w:after="160" w:line="240" w:lineRule="auto"/>
+        <w:jc w:val="center"/>
+      </w:pPr>
+      <w:r>
+        <w:rPr>
+          <w:rFonts w:ascii="Times New Roman" w:hAnsi="Times New Roman"/>
+          <w:i/>
+          <w:color w:val="333333"/>
+          <w:sz w:val="19"/>
+        </w:rPr>
+        <w:t>Gambar 4. Grafik analisis latensi aliran data real-time SSE.</w:t>
+      </w:r>
+    </w:p>
+    <w:p>
+      <w:pPr>
+        <w:spacing w:before="0" w:after="120" w:line="360" w:lineRule="auto"/>
         <w:ind w:firstLine="720"/>
         <w:jc w:val="both"/>
       </w:pPr>
@@ -2209,27 +3090,7 @@
           <w:color w:val="000000"/>
           <w:sz w:val="24"/>
         </w:rPr>
-        <w:t xml:space="preserve">Backend NestJS bertindak sebagai orkestrator yang mengekstrak blok pemikiran logis (`part.thought` atau `reasoning_content`) secara programmatic dan mengirimkannya ke dalam aliran data terpisah dari pesan jawaban utama. Pada sisi klien Flutter, stream data ditangkap dan diuraikan secara dinamis. Ponsel warga akan merender blok pemikiran tersebut ke dalam widget </w:t>
-      </w:r>
-      <w:r>
-        <w:rPr>
-          <w:rFonts w:ascii="Times New Roman" w:hAnsi="Times New Roman"/>
-          <w:b/>
-          <w:i w:val="0"/>
-          <w:color w:val="000000"/>
-          <w:sz w:val="24"/>
-        </w:rPr>
-        <w:t>Collapsible Thinking Panel</w:t>
-      </w:r>
-      <w:r>
-        <w:rPr>
-          <w:rFonts w:ascii="Times New Roman" w:hAnsi="Times New Roman"/>
-          <w:b w:val="0"/>
-          <w:i w:val="0"/>
-          <w:color w:val="000000"/>
-          <w:sz w:val="24"/>
-        </w:rPr>
-        <w:t xml:space="preserve"> yang interaktif, dilengkapi indikator stopwatch mikro untuk melacak durasi berpikir model secara transparan.</w:t>
+        <w:t>Aplikasi Flutter menangkap stream data ini secara real-time. Bagian `reasoning_content` langsung disalurkan ke widget panel berpikir lipat (collapsible panel), sementara bagian `content` utama digabungkan dan ditampilkan menggunakan efek typewriter dengan delta-time konstan untuk menyajikan visualisasi yang mulus tanpa mengorbankan memori perangkat.</w:t>
       </w:r>
     </w:p>
     <w:p>
@@ -2250,12 +3111,12 @@
           <w:color w:val="000000"/>
           <w:sz w:val="24"/>
         </w:rPr>
-        <w:t>5.1 Arsitektur Hybrid RAG &amp; Perutean Model Dinamis</w:t>
+        <w:t>VII. HYBRID RAG &amp; PERUTEAN MODEL DINAMIS</w:t>
       </w:r>
     </w:p>
     <w:p>
       <w:pPr>
-        <w:spacing w:before="0" w:after="80" w:line="360" w:lineRule="auto"/>
+        <w:spacing w:before="0" w:after="120" w:line="360" w:lineRule="auto"/>
         <w:ind w:firstLine="720"/>
         <w:jc w:val="both"/>
       </w:pPr>
@@ -2267,35 +3128,15 @@
           <w:color w:val="000000"/>
           <w:sz w:val="24"/>
         </w:rPr>
-        <w:t>Menghadapi tingginya variasi kueri yang dikirimkan warga, sistem menerapkan pola perutean dinamis berbasis kategori konten. Kueri warga yang bersifat sapaan ringan atau instruksi UI sederhana langsung diarahkan ke model Gemini 2.5 Flash Lite demi menghemat daya komputasi dan biaya sewa server. Sebaliknya, pertanyaan warga terkait hukum lingkungan daerah, mekanisme AMDAL, atau denda pelanggaran regulasi diarahkan ke sistem asisten hukum cerdas berbasis RAG.</w:t>
+        <w:t>Untuk menekan biaya sewa server kecerdasan buatan, Genesis menggunakan pola perutean kueri secara hibrida. Kueri warga dianalisis kategorinya oleh modul Router backend. Kueri non-teknis yang bersifat sapaan ringan dialihkan ke Gemini 2.5 Flash Lite yang hemat biaya. Namun, jika kueri mengandung pertanyaan terkait aturan perundang-undangan lingkungan hidup, kueri tersebut dilarikan ke sistem Vertex AI Search RAG.</w:t>
       </w:r>
     </w:p>
     <w:p>
       <w:pPr>
-        <w:spacing w:before="0" w:after="80" w:line="360" w:lineRule="auto"/>
+        <w:spacing w:before="0" w:after="120" w:line="360" w:lineRule="auto"/>
         <w:ind w:firstLine="720"/>
         <w:jc w:val="both"/>
       </w:pPr>
-      <w:r>
-        <w:rPr>
-          <w:rFonts w:ascii="Times New Roman" w:hAnsi="Times New Roman"/>
-          <w:b w:val="0"/>
-          <w:i w:val="0"/>
-          <w:color w:val="000000"/>
-          <w:sz w:val="24"/>
-        </w:rPr>
-        <w:t xml:space="preserve">Sistem RAG (Retrieval-Augmented Generation) pada Genesis diintegrasikan secara native menggunakan </w:t>
-      </w:r>
-      <w:r>
-        <w:rPr>
-          <w:rFonts w:ascii="Times New Roman" w:hAnsi="Times New Roman"/>
-          <w:b/>
-          <w:i w:val="0"/>
-          <w:color w:val="000000"/>
-          <w:sz w:val="24"/>
-        </w:rPr>
-        <w:t>Vertex AI Search</w:t>
-      </w:r>
       <w:r>
         <w:rPr>
           <w:rFonts w:ascii="Times New Roman" w:hAnsi="Times New Roman"/>
@@ -2304,7 +3145,7 @@
           <w:color w:val="000000"/>
           <w:sz w:val="24"/>
         </w:rPr>
-        <w:t>. Dokumen hukum resmi berupa berkas PDF dari portal regulasi pemerintah diserap, diindeks secara semantik, dan dicari kecocokannya dengan kueri warga. Konteks pasal hukum yang relevan kemudian digabungkan ke dalam prompt instruksi sistem Gemini 3.5 Flash. Pendekatan hibrida ini menjamin jawaban yang dikeluarkan AI memiliki tingkat akurasi tinggi dan menyertakan kutipan hukum valid sehingga bebas dari halusinasi informasi.</w:t>
+        <w:t>Vertex AI Search melakukan pencarian semantik (semantic search) di dalam basis dokumen hukum lingkungan hidup (UU No. 32 Tahun 2009, PP, dan Perda). Pasal hukum yang paling relevan diekstraksi sebagai konteks tepercaya, lalu disisipkan ke dalam instruksi prompt sistem untuk diselesaikan oleh Gemini 3.5 Flash. Sistem hibrida RAG ini sepenuhnya membasmi kemungkinan terjadinya halusinasi informasi hukum, menjamin setiap jawaban asisten menyertakan pasal hukum resmi yang sah dan valid.</w:t>
       </w:r>
     </w:p>
     <w:p>
@@ -2325,12 +3166,29 @@
           <w:color w:val="000000"/>
           <w:sz w:val="24"/>
         </w:rPr>
-        <w:t>6.1 Mesin Gamifikasi &amp; Peringkat Kontribusi Spasial Warga</w:t>
+        <w:t>VIII. MESIN GAMIFIKASI &amp; LEADERBOARD DATA RIIL</w:t>
       </w:r>
     </w:p>
     <w:p>
       <w:pPr>
-        <w:spacing w:before="0" w:after="80" w:line="360" w:lineRule="auto"/>
+        <w:spacing w:before="0" w:after="120" w:line="360" w:lineRule="auto"/>
+        <w:ind w:firstLine="720"/>
+        <w:jc w:val="both"/>
+      </w:pPr>
+      <w:r>
+        <w:rPr>
+          <w:rFonts w:ascii="Times New Roman" w:hAnsi="Times New Roman"/>
+          <w:b w:val="0"/>
+          <w:i/>
+          <w:color w:val="000000"/>
+          <w:sz w:val="24"/>
+        </w:rPr>
+        <w:t>Partisipasi berkelanjutan warga dijaga melalui modul Gamifikasi yang terintegrasi secara aman di dalam database PostgreSQL. Setiap laporan kerusakan lingkungan yang tervalidasi oleh DLH atau interaksi positif dalam konsultasi regulasi memicu webhook backend untuk menyelesaikan tantangan harian (Daily Quests) secara otomatis.</w:t>
+      </w:r>
+    </w:p>
+    <w:p>
+      <w:pPr>
+        <w:spacing w:before="0" w:after="120" w:line="360" w:lineRule="auto"/>
         <w:ind w:firstLine="720"/>
         <w:jc w:val="both"/>
       </w:pPr>
@@ -2342,12 +3200,63 @@
           <w:color w:val="000000"/>
           <w:sz w:val="24"/>
         </w:rPr>
-        <w:t>Salah satu pilar utama keberlanjutan platform crowdsourcing adalah tingkat partisipasi aktif masyarakat dalam jangka panjang. Genesis merangsang keterlibatan warga menggunakan sistem gamifikasi yang terintegrasi secara aman dengan logika bisnis backend. Setiap laporan kerusakan lingkungan yang tervalidasi atau partisipasi dalam konsultasi hukum memicu webhook otomatis di backend untuk menyelesaikan tantangan harian (Daily Quests).</w:t>
+        <w:t>Penyelesaian tantangan harian memicu penambahan Experience Points (XP) dan koin virtual warga. Papan peringkat global (Leaderboard) disusun secara berkala berdasarkan akumulasi XP warga. Gambar 5 menyajikan visualisasi data riil papan peringkat kontribusi warga Genesis, menampilkan peringkat tiga besar tim pengembang sebagai representasi kontribusi aktif dalam sistem nyata.</w:t>
+      </w:r>
+    </w:p>
+    <w:p>
+      <w:r>
+        <w:drawing>
+          <wp:inline xmlns:a="http://schemas.openxmlformats.org/drawingml/2006/main" xmlns:pic="http://schemas.openxmlformats.org/drawingml/2006/picture">
+            <wp:extent cx="5040000" cy="2491664"/>
+            <wp:docPr id="4" name="Picture 4"/>
+            <wp:cNvGraphicFramePr>
+              <a:graphicFrameLocks noChangeAspect="1"/>
+            </wp:cNvGraphicFramePr>
+            <a:graphic>
+              <a:graphicData uri="http://schemas.openxmlformats.org/drawingml/2006/picture">
+                <pic:pic>
+                  <pic:nvPicPr>
+                    <pic:cNvPr id="0" name="diagram_leaderboard.png"/>
+                    <pic:cNvPicPr/>
+                  </pic:nvPicPr>
+                  <pic:blipFill>
+                    <a:blip r:embed="rId12"/>
+                    <a:stretch>
+                      <a:fillRect/>
+                    </a:stretch>
+                  </pic:blipFill>
+                  <pic:spPr>
+                    <a:xfrm>
+                      <a:off x="0" y="0"/>
+                      <a:ext cx="5040000" cy="2491664"/>
+                    </a:xfrm>
+                    <a:prstGeom prst="rect"/>
+                  </pic:spPr>
+                </pic:pic>
+              </a:graphicData>
+            </a:graphic>
+          </wp:inline>
+        </w:drawing>
       </w:r>
     </w:p>
     <w:p>
       <w:pPr>
-        <w:spacing w:before="0" w:after="80" w:line="360" w:lineRule="auto"/>
+        <w:spacing w:before="80" w:after="160" w:line="240" w:lineRule="auto"/>
+        <w:jc w:val="center"/>
+      </w:pPr>
+      <w:r>
+        <w:rPr>
+          <w:rFonts w:ascii="Times New Roman" w:hAnsi="Times New Roman"/>
+          <w:i/>
+          <w:color w:val="333333"/>
+          <w:sz w:val="19"/>
+        </w:rPr>
+        <w:t>Gambar 5. Grafik visualisasi data riil Genesis Leaderboard.</w:t>
+      </w:r>
+    </w:p>
+    <w:p>
+      <w:pPr>
+        <w:spacing w:before="0" w:after="120" w:line="360" w:lineRule="auto"/>
         <w:ind w:firstLine="720"/>
         <w:jc w:val="both"/>
       </w:pPr>
@@ -2355,11 +3264,11 @@
         <w:rPr>
           <w:rFonts w:ascii="Times New Roman" w:hAnsi="Times New Roman"/>
           <w:b w:val="0"/>
-          <w:i/>
+          <w:i w:val="0"/>
           <w:color w:val="000000"/>
           <w:sz w:val="24"/>
         </w:rPr>
-        <w:t>Setelah fungsi `completeChallenge` selesai divalidasi, sistem memperbarui database PostgreSQL secara real-time untuk menambahkan Experience Points (XP) dan koin virtual warga. XP digunakan untuk menaikkan level kontribusi warga yang ditampilkan pada papan peringkat spasial global (Leaderboard), sementara koin virtual dapat diakumulasikan dan ditukarkan dengan insentif ekonomi nyata (seperti voucher belanja atau bahan pangan) pada bank daur ulang atau merchant rekanan lokal, menutup rantai sirkuler aksi iklim.</w:t>
+        <w:t>Koin virtual yang dikumpulkan oleh warga dapat ditukarkan secara langsung dengan insentif ekonomi nyata (seperti voucher belanja bahan pokok atau token listrik) di bank sampah digital lokal. Pendekatan sirkuler ini memastikan aksi iklim warga melahirkan dampak ekonomi positif nyata secara berkelanjutan.</w:t>
       </w:r>
     </w:p>
     <w:p>
@@ -2380,12 +3289,12 @@
           <w:color w:val="000000"/>
           <w:sz w:val="24"/>
         </w:rPr>
-        <w:t>7.1 Responsible AI &amp; Safety-by-Design Guidelines</w:t>
+        <w:t>IX. RESPONSIBLE AI &amp; SAFETY-BY-DESIGN GUIDELINES</w:t>
       </w:r>
     </w:p>
     <w:p>
       <w:pPr>
-        <w:spacing w:before="0" w:after="80" w:line="360" w:lineRule="auto"/>
+        <w:spacing w:before="0" w:after="120" w:line="360" w:lineRule="auto"/>
         <w:ind w:firstLine="720"/>
         <w:jc w:val="both"/>
       </w:pPr>
@@ -2397,7 +3306,7 @@
           <w:color w:val="000000"/>
           <w:sz w:val="24"/>
         </w:rPr>
-        <w:t>Penerapan kecerdasan artifisial pada platform publik wajib mengedepankan etika, transparansi, keandalan, dan keamanan data. Genesis merancang kerangka kerja etika AI yang merujuk pada pilar Responsible AI tingkat dunia untuk memitigasi seluruh kemungkinan risiko kegagalan sistem dan bias klasifikasi.</w:t>
+        <w:t>Penerapan sistem kecerdasan buatan pada ranah pelayanan publik menuntut adanya pengaman etika dan keamanan data yang ekstra ketat. Genesis merancang seluruh fiturnya mengacu pada pilar utama Responsible AI untuk meminimalisir dampak bias keputusan, penyalahgunaan model, dan kebocoran informasi pribadi warga.</w:t>
       </w:r>
     </w:p>
     <w:tbl>
@@ -2491,7 +3400,7 @@
                 <w:color w:val="000000"/>
                 <w:sz w:val="20"/>
               </w:rPr>
-              <w:t xml:space="preserve">Responsible </w:t>
+              <w:t xml:space="preserve">Etika </w:t>
             </w:r>
             <w:r>
               <w:rPr>
@@ -2537,7 +3446,7 @@
                 <w:color w:val="000000"/>
                 <w:sz w:val="20"/>
               </w:rPr>
-              <w:t xml:space="preserve">Aktivitas </w:t>
+              <w:t xml:space="preserve">Implementasi </w:t>
             </w:r>
             <w:r>
               <w:rPr>
@@ -2547,7 +3456,7 @@
                 <w:color w:val="000000"/>
                 <w:sz w:val="20"/>
               </w:rPr>
-              <w:t xml:space="preserve">Mitigasi </w:t>
+              <w:t xml:space="preserve">Nyata </w:t>
             </w:r>
             <w:r>
               <w:rPr>
@@ -2563,11 +3472,11 @@
               <w:rPr>
                 <w:rFonts w:ascii="Times New Roman" w:hAnsi="Times New Roman"/>
                 <w:b/>
-                <w:i w:val="0"/>
+                <w:i/>
                 <w:color w:val="000000"/>
                 <w:sz w:val="20"/>
               </w:rPr>
-              <w:t xml:space="preserve">Implementasi </w:t>
+              <w:t xml:space="preserve">Strategi </w:t>
             </w:r>
             <w:r>
               <w:rPr>
@@ -2577,7 +3486,7 @@
                 <w:color w:val="000000"/>
                 <w:sz w:val="20"/>
               </w:rPr>
-              <w:t xml:space="preserve">Nyata </w:t>
+              <w:t xml:space="preserve">Mitigasi </w:t>
             </w:r>
             <w:r>
               <w:rPr>
@@ -2689,7 +3598,17 @@
                 <w:color w:val="000000"/>
                 <w:sz w:val="20"/>
               </w:rPr>
-              <w:t xml:space="preserve">Keamanan </w:t>
+              <w:t xml:space="preserve">Perlindungan </w:t>
+            </w:r>
+            <w:r>
+              <w:rPr>
+                <w:rFonts w:ascii="Times New Roman" w:hAnsi="Times New Roman"/>
+                <w:b/>
+                <w:i w:val="0"/>
+                <w:color w:val="000000"/>
+                <w:sz w:val="20"/>
+              </w:rPr>
+              <w:t xml:space="preserve">Data </w:t>
             </w:r>
           </w:p>
         </w:tc>
@@ -2724,7 +3643,27 @@
                 <w:color w:val="000000"/>
                 <w:sz w:val="20"/>
               </w:rPr>
-              <w:t xml:space="preserve">Pemburaman </w:t>
+              <w:t xml:space="preserve">Proses </w:t>
+            </w:r>
+            <w:r>
+              <w:rPr>
+                <w:rFonts w:ascii="Times New Roman" w:hAnsi="Times New Roman"/>
+                <w:b w:val="0"/>
+                <w:i/>
+                <w:color w:val="000000"/>
+                <w:sz w:val="20"/>
+              </w:rPr>
+              <w:t xml:space="preserve">blurring </w:t>
+            </w:r>
+            <w:r>
+              <w:rPr>
+                <w:rFonts w:ascii="Times New Roman" w:hAnsi="Times New Roman"/>
+                <w:b w:val="0"/>
+                <w:i w:val="0"/>
+                <w:color w:val="000000"/>
+                <w:sz w:val="20"/>
+              </w:rPr>
+              <w:t xml:space="preserve">objek </w:t>
             </w:r>
             <w:r>
               <w:rPr>
@@ -2754,6 +3693,16 @@
                 <w:color w:val="000000"/>
                 <w:sz w:val="20"/>
               </w:rPr>
+              <w:t xml:space="preserve">plat </w:t>
+            </w:r>
+            <w:r>
+              <w:rPr>
+                <w:rFonts w:ascii="Times New Roman" w:hAnsi="Times New Roman"/>
+                <w:b w:val="0"/>
+                <w:i w:val="0"/>
+                <w:color w:val="000000"/>
+                <w:sz w:val="20"/>
+              </w:rPr>
               <w:t xml:space="preserve">nomor </w:t>
             </w:r>
             <w:r>
@@ -2764,7 +3713,7 @@
                 <w:color w:val="000000"/>
                 <w:sz w:val="20"/>
               </w:rPr>
-              <w:t xml:space="preserve">plat </w:t>
+              <w:t xml:space="preserve">kendaraan </w:t>
             </w:r>
             <w:r>
               <w:rPr>
@@ -2774,7 +3723,17 @@
                 <w:color w:val="000000"/>
                 <w:sz w:val="20"/>
               </w:rPr>
-              <w:t xml:space="preserve">diproses </w:t>
+              <w:t xml:space="preserve">dilakukan </w:t>
+            </w:r>
+            <w:r>
+              <w:rPr>
+                <w:rFonts w:ascii="Times New Roman" w:hAnsi="Times New Roman"/>
+                <w:b w:val="0"/>
+                <w:i w:val="0"/>
+                <w:color w:val="000000"/>
+                <w:sz w:val="20"/>
+              </w:rPr>
+              <w:t xml:space="preserve">instan </w:t>
             </w:r>
             <w:r>
               <w:rPr>
@@ -2785,16 +3744,6 @@
                 <w:sz w:val="20"/>
               </w:rPr>
               <w:t xml:space="preserve">di </w:t>
-            </w:r>
-            <w:r>
-              <w:rPr>
-                <w:rFonts w:ascii="Times New Roman" w:hAnsi="Times New Roman"/>
-                <w:b w:val="0"/>
-                <w:i w:val="0"/>
-                <w:color w:val="000000"/>
-                <w:sz w:val="20"/>
-              </w:rPr>
-              <w:t xml:space="preserve">memori </w:t>
             </w:r>
             <w:r>
               <w:rPr>
@@ -2824,26 +3773,6 @@
                 <w:color w:val="000000"/>
                 <w:sz w:val="20"/>
               </w:rPr>
-              <w:t xml:space="preserve">secara </w:t>
-            </w:r>
-            <w:r>
-              <w:rPr>
-                <w:rFonts w:ascii="Times New Roman" w:hAnsi="Times New Roman"/>
-                <w:b w:val="0"/>
-                <w:i w:val="0"/>
-                <w:color w:val="000000"/>
-                <w:sz w:val="20"/>
-              </w:rPr>
-              <w:t xml:space="preserve">volatil </w:t>
-            </w:r>
-            <w:r>
-              <w:rPr>
-                <w:rFonts w:ascii="Times New Roman" w:hAnsi="Times New Roman"/>
-                <w:b w:val="0"/>
-                <w:i w:val="0"/>
-                <w:color w:val="000000"/>
-                <w:sz w:val="20"/>
-              </w:rPr>
               <w:t xml:space="preserve">sebelum </w:t>
             </w:r>
             <w:r>
@@ -2854,7 +3783,7 @@
                 <w:color w:val="000000"/>
                 <w:sz w:val="20"/>
               </w:rPr>
-              <w:t xml:space="preserve">disimpan </w:t>
+              <w:t xml:space="preserve">file </w:t>
             </w:r>
             <w:r>
               <w:rPr>
@@ -2864,27 +3793,7 @@
                 <w:color w:val="000000"/>
                 <w:sz w:val="20"/>
               </w:rPr>
-              <w:t xml:space="preserve">di </w:t>
-            </w:r>
-            <w:r>
-              <w:rPr>
-                <w:rFonts w:ascii="Times New Roman" w:hAnsi="Times New Roman"/>
-                <w:b w:val="0"/>
-                <w:i w:val="0"/>
-                <w:color w:val="000000"/>
-                <w:sz w:val="20"/>
-              </w:rPr>
-              <w:t xml:space="preserve">cloud </w:t>
-            </w:r>
-            <w:r>
-              <w:rPr>
-                <w:rFonts w:ascii="Times New Roman" w:hAnsi="Times New Roman"/>
-                <w:b w:val="0"/>
-                <w:i w:val="0"/>
-                <w:color w:val="000000"/>
-                <w:sz w:val="20"/>
-              </w:rPr>
-              <w:t xml:space="preserve">GCS. </w:t>
+              <w:t xml:space="preserve">disimpan. </w:t>
             </w:r>
           </w:p>
         </w:tc>
@@ -2966,17 +3875,7 @@
                 <w:color w:val="000000"/>
                 <w:sz w:val="20"/>
               </w:rPr>
-              <w:t xml:space="preserve">&amp; </w:t>
-            </w:r>
-            <w:r>
-              <w:rPr>
-                <w:rFonts w:ascii="Times New Roman" w:hAnsi="Times New Roman"/>
-                <w:b/>
-                <w:i w:val="0"/>
-                <w:color w:val="000000"/>
-                <w:sz w:val="20"/>
-              </w:rPr>
-              <w:t xml:space="preserve">Akuntabilitas </w:t>
+              <w:t xml:space="preserve">Keputusan </w:t>
             </w:r>
           </w:p>
         </w:tc>
@@ -3011,7 +3910,37 @@
                 <w:color w:val="000000"/>
                 <w:sz w:val="20"/>
               </w:rPr>
-              <w:t xml:space="preserve">Menyajikan </w:t>
+              <w:t xml:space="preserve">Model </w:t>
+            </w:r>
+            <w:r>
+              <w:rPr>
+                <w:rFonts w:ascii="Times New Roman" w:hAnsi="Times New Roman"/>
+                <w:b w:val="0"/>
+                <w:i w:val="0"/>
+                <w:color w:val="000000"/>
+                <w:sz w:val="20"/>
+              </w:rPr>
+              <w:t xml:space="preserve">AI </w:t>
+            </w:r>
+            <w:r>
+              <w:rPr>
+                <w:rFonts w:ascii="Times New Roman" w:hAnsi="Times New Roman"/>
+                <w:b w:val="0"/>
+                <w:i w:val="0"/>
+                <w:color w:val="000000"/>
+                <w:sz w:val="20"/>
+              </w:rPr>
+              <w:t xml:space="preserve">wajib </w:t>
+            </w:r>
+            <w:r>
+              <w:rPr>
+                <w:rFonts w:ascii="Times New Roman" w:hAnsi="Times New Roman"/>
+                <w:b w:val="0"/>
+                <w:i w:val="0"/>
+                <w:color w:val="000000"/>
+                <w:sz w:val="20"/>
+              </w:rPr>
+              <w:t xml:space="preserve">memuntahkan </w:t>
             </w:r>
             <w:r>
               <w:rPr>
@@ -3031,7 +3960,7 @@
                 <w:color w:val="000000"/>
                 <w:sz w:val="20"/>
               </w:rPr>
-              <w:t xml:space="preserve">keyakinan </w:t>
+              <w:t xml:space="preserve">akurasi </w:t>
             </w:r>
             <w:r>
               <w:rPr>
@@ -3051,16 +3980,6 @@
                 <w:color w:val="000000"/>
                 <w:sz w:val="20"/>
               </w:rPr>
-              <w:t xml:space="preserve">AI </w:t>
-            </w:r>
-            <w:r>
-              <w:rPr>
-                <w:rFonts w:ascii="Times New Roman" w:hAnsi="Times New Roman"/>
-                <w:b w:val="0"/>
-                <w:i w:val="0"/>
-                <w:color w:val="000000"/>
-                <w:sz w:val="20"/>
-              </w:rPr>
               <w:t xml:space="preserve">dan </w:t>
             </w:r>
             <w:r>
@@ -3071,7 +3990,7 @@
                 <w:color w:val="000000"/>
                 <w:sz w:val="20"/>
               </w:rPr>
-              <w:t xml:space="preserve">melampirkan </w:t>
+              <w:t xml:space="preserve">menyertakan </w:t>
             </w:r>
             <w:r>
               <w:rPr>
@@ -3081,7 +4000,7 @@
                 <w:color w:val="000000"/>
                 <w:sz w:val="20"/>
               </w:rPr>
-              <w:t xml:space="preserve">referensi </w:t>
+              <w:t xml:space="preserve">rujukan </w:t>
             </w:r>
             <w:r>
               <w:rPr>
@@ -3111,47 +4030,7 @@
                 <w:color w:val="000000"/>
                 <w:sz w:val="20"/>
               </w:rPr>
-              <w:t xml:space="preserve">resmi </w:t>
-            </w:r>
-            <w:r>
-              <w:rPr>
-                <w:rFonts w:ascii="Times New Roman" w:hAnsi="Times New Roman"/>
-                <w:b w:val="0"/>
-                <w:i w:val="0"/>
-                <w:color w:val="000000"/>
-                <w:sz w:val="20"/>
-              </w:rPr>
-              <w:t xml:space="preserve">untuk </w:t>
-            </w:r>
-            <w:r>
-              <w:rPr>
-                <w:rFonts w:ascii="Times New Roman" w:hAnsi="Times New Roman"/>
-                <w:b w:val="0"/>
-                <w:i w:val="0"/>
-                <w:color w:val="000000"/>
-                <w:sz w:val="20"/>
-              </w:rPr>
-              <w:t xml:space="preserve">mencegah </w:t>
-            </w:r>
-            <w:r>
-              <w:rPr>
-                <w:rFonts w:ascii="Times New Roman" w:hAnsi="Times New Roman"/>
-                <w:b w:val="0"/>
-                <w:i w:val="0"/>
-                <w:color w:val="000000"/>
-                <w:sz w:val="20"/>
-              </w:rPr>
-              <w:t xml:space="preserve">informasi </w:t>
-            </w:r>
-            <w:r>
-              <w:rPr>
-                <w:rFonts w:ascii="Times New Roman" w:hAnsi="Times New Roman"/>
-                <w:b w:val="0"/>
-                <w:i w:val="0"/>
-                <w:color w:val="000000"/>
-                <w:sz w:val="20"/>
-              </w:rPr>
-              <w:t xml:space="preserve">palsu. </w:t>
+              <w:t xml:space="preserve">asli. </w:t>
             </w:r>
           </w:p>
         </w:tc>
@@ -3223,7 +4102,7 @@
                 <w:color w:val="000000"/>
                 <w:sz w:val="20"/>
               </w:rPr>
-              <w:t xml:space="preserve">Keandalan </w:t>
+              <w:t xml:space="preserve">Keamanan </w:t>
             </w:r>
             <w:r>
               <w:rPr>
@@ -3233,7 +4112,7 @@
                 <w:color w:val="000000"/>
                 <w:sz w:val="20"/>
               </w:rPr>
-              <w:t xml:space="preserve">&amp; </w:t>
+              <w:t xml:space="preserve">Terhadap </w:t>
             </w:r>
             <w:r>
               <w:rPr>
@@ -3243,7 +4122,7 @@
                 <w:color w:val="000000"/>
                 <w:sz w:val="20"/>
               </w:rPr>
-              <w:t xml:space="preserve">Ketahanan </w:t>
+              <w:t xml:space="preserve">Eksploitasi </w:t>
             </w:r>
           </w:p>
         </w:tc>
@@ -3284,11 +4163,41 @@
               <w:rPr>
                 <w:rFonts w:ascii="Times New Roman" w:hAnsi="Times New Roman"/>
                 <w:b w:val="0"/>
+                <w:i/>
+                <w:color w:val="000000"/>
+                <w:sz w:val="20"/>
+              </w:rPr>
+              <w:t xml:space="preserve">rate-limiting </w:t>
+            </w:r>
+            <w:r>
+              <w:rPr>
+                <w:rFonts w:ascii="Times New Roman" w:hAnsi="Times New Roman"/>
+                <w:b w:val="0"/>
                 <w:i w:val="0"/>
                 <w:color w:val="000000"/>
                 <w:sz w:val="20"/>
               </w:rPr>
-              <w:t xml:space="preserve">modul </w:t>
+              <w:t xml:space="preserve">ketat </w:t>
+            </w:r>
+            <w:r>
+              <w:rPr>
+                <w:rFonts w:ascii="Times New Roman" w:hAnsi="Times New Roman"/>
+                <w:b w:val="0"/>
+                <w:i w:val="0"/>
+                <w:color w:val="000000"/>
+                <w:sz w:val="20"/>
+              </w:rPr>
+              <w:t xml:space="preserve">di </w:t>
+            </w:r>
+            <w:r>
+              <w:rPr>
+                <w:rFonts w:ascii="Times New Roman" w:hAnsi="Times New Roman"/>
+                <w:b w:val="0"/>
+                <w:i w:val="0"/>
+                <w:color w:val="000000"/>
+                <w:sz w:val="20"/>
+              </w:rPr>
+              <w:t xml:space="preserve">NestJS </w:t>
             </w:r>
             <w:r>
               <w:rPr>
@@ -3298,37 +4207,7 @@
                 <w:color w:val="000000"/>
                 <w:sz w:val="20"/>
               </w:rPr>
-              <w:t xml:space="preserve">rate </w:t>
-            </w:r>
-            <w:r>
-              <w:rPr>
-                <w:rFonts w:ascii="Times New Roman" w:hAnsi="Times New Roman"/>
-                <w:b w:val="0"/>
-                <w:i/>
-                <w:color w:val="000000"/>
-                <w:sz w:val="20"/>
-              </w:rPr>
-              <w:t xml:space="preserve">limiting </w:t>
-            </w:r>
-            <w:r>
-              <w:rPr>
-                <w:rFonts w:ascii="Times New Roman" w:hAnsi="Times New Roman"/>
-                <w:b w:val="0"/>
-                <w:i w:val="0"/>
-                <w:color w:val="000000"/>
-                <w:sz w:val="20"/>
-              </w:rPr>
-              <w:t xml:space="preserve">pada </w:t>
-            </w:r>
-            <w:r>
-              <w:rPr>
-                <w:rFonts w:ascii="Times New Roman" w:hAnsi="Times New Roman"/>
-                <w:b w:val="0"/>
-                <w:i w:val="0"/>
-                <w:color w:val="000000"/>
-                <w:sz w:val="20"/>
-              </w:rPr>
-              <w:t xml:space="preserve">backend </w:t>
+              <w:t xml:space="preserve">Gateway </w:t>
             </w:r>
             <w:r>
               <w:rPr>
@@ -3358,7 +4237,7 @@
                 <w:color w:val="000000"/>
                 <w:sz w:val="20"/>
               </w:rPr>
-              <w:t xml:space="preserve">eksploitasi </w:t>
+              <w:t xml:space="preserve">serangan </w:t>
             </w:r>
             <w:r>
               <w:rPr>
@@ -3368,7 +4247,17 @@
                 <w:color w:val="000000"/>
                 <w:sz w:val="20"/>
               </w:rPr>
-              <w:t xml:space="preserve">API </w:t>
+              <w:t xml:space="preserve">brute </w:t>
+            </w:r>
+            <w:r>
+              <w:rPr>
+                <w:rFonts w:ascii="Times New Roman" w:hAnsi="Times New Roman"/>
+                <w:b w:val="0"/>
+                <w:i w:val="0"/>
+                <w:color w:val="000000"/>
+                <w:sz w:val="20"/>
+              </w:rPr>
+              <w:t xml:space="preserve">force </w:t>
             </w:r>
             <w:r>
               <w:rPr>
@@ -3379,26 +4268,6 @@
                 <w:sz w:val="20"/>
               </w:rPr>
               <w:t xml:space="preserve">dan </w:t>
-            </w:r>
-            <w:r>
-              <w:rPr>
-                <w:rFonts w:ascii="Times New Roman" w:hAnsi="Times New Roman"/>
-                <w:b w:val="0"/>
-                <w:i w:val="0"/>
-                <w:color w:val="000000"/>
-                <w:sz w:val="20"/>
-              </w:rPr>
-              <w:t xml:space="preserve">mitigasi </w:t>
-            </w:r>
-            <w:r>
-              <w:rPr>
-                <w:rFonts w:ascii="Times New Roman" w:hAnsi="Times New Roman"/>
-                <w:b w:val="0"/>
-                <w:i w:val="0"/>
-                <w:color w:val="000000"/>
-                <w:sz w:val="20"/>
-              </w:rPr>
-              <w:t xml:space="preserve">serangan </w:t>
             </w:r>
             <w:r>
               <w:rPr>
@@ -3490,7 +4359,17 @@
                 <w:color w:val="000000"/>
                 <w:sz w:val="20"/>
               </w:rPr>
-              <w:t xml:space="preserve">Peran </w:t>
+              <w:t xml:space="preserve">Kendali </w:t>
+            </w:r>
+            <w:r>
+              <w:rPr>
+                <w:rFonts w:ascii="Times New Roman" w:hAnsi="Times New Roman"/>
+                <w:b/>
+                <w:i w:val="0"/>
+                <w:color w:val="000000"/>
+                <w:sz w:val="20"/>
+              </w:rPr>
+              <w:t xml:space="preserve">Otoritas </w:t>
             </w:r>
             <w:r>
               <w:rPr>
@@ -3501,16 +4380,6 @@
                 <w:sz w:val="20"/>
               </w:rPr>
               <w:t xml:space="preserve">Manusia </w:t>
-            </w:r>
-            <w:r>
-              <w:rPr>
-                <w:rFonts w:ascii="Times New Roman" w:hAnsi="Times New Roman"/>
-                <w:b/>
-                <w:i/>
-                <w:color w:val="000000"/>
-                <w:sz w:val="20"/>
-              </w:rPr>
-              <w:t xml:space="preserve">(HITL) </w:t>
             </w:r>
           </w:p>
         </w:tc>
@@ -3545,7 +4414,7 @@
                 <w:color w:val="000000"/>
                 <w:sz w:val="20"/>
               </w:rPr>
-              <w:t xml:space="preserve">Kecerdasan </w:t>
+              <w:t xml:space="preserve">Model </w:t>
             </w:r>
             <w:r>
               <w:rPr>
@@ -3555,7 +4424,7 @@
                 <w:color w:val="000000"/>
                 <w:sz w:val="20"/>
               </w:rPr>
-              <w:t xml:space="preserve">artifisial </w:t>
+              <w:t xml:space="preserve">AI </w:t>
             </w:r>
             <w:r>
               <w:rPr>
@@ -3565,7 +4434,7 @@
                 <w:color w:val="000000"/>
                 <w:sz w:val="20"/>
               </w:rPr>
-              <w:t xml:space="preserve">bertindak </w:t>
+              <w:t xml:space="preserve">dilarang </w:t>
             </w:r>
             <w:r>
               <w:rPr>
@@ -3575,7 +4444,7 @@
                 <w:color w:val="000000"/>
                 <w:sz w:val="20"/>
               </w:rPr>
-              <w:t xml:space="preserve">sebagai </w:t>
+              <w:t xml:space="preserve">menyetujui </w:t>
             </w:r>
             <w:r>
               <w:rPr>
@@ -3585,7 +4454,7 @@
                 <w:color w:val="000000"/>
                 <w:sz w:val="20"/>
               </w:rPr>
-              <w:t xml:space="preserve">asisten </w:t>
+              <w:t xml:space="preserve">sanksi </w:t>
             </w:r>
             <w:r>
               <w:rPr>
@@ -3595,7 +4464,7 @@
                 <w:color w:val="000000"/>
                 <w:sz w:val="20"/>
               </w:rPr>
-              <w:t xml:space="preserve">pendukung </w:t>
+              <w:t xml:space="preserve">secara </w:t>
             </w:r>
             <w:r>
               <w:rPr>
@@ -3605,7 +4474,7 @@
                 <w:color w:val="000000"/>
                 <w:sz w:val="20"/>
               </w:rPr>
-              <w:t xml:space="preserve">keputusan, </w:t>
+              <w:t xml:space="preserve">mandiri; </w:t>
             </w:r>
             <w:r>
               <w:rPr>
@@ -3625,27 +4494,7 @@
                 <w:color w:val="000000"/>
                 <w:sz w:val="20"/>
               </w:rPr>
-              <w:t xml:space="preserve">akhir </w:t>
-            </w:r>
-            <w:r>
-              <w:rPr>
-                <w:rFonts w:ascii="Times New Roman" w:hAnsi="Times New Roman"/>
-                <w:b w:val="0"/>
-                <w:i w:val="0"/>
-                <w:color w:val="000000"/>
-                <w:sz w:val="20"/>
-              </w:rPr>
-              <w:t xml:space="preserve">persetujuan </w:t>
-            </w:r>
-            <w:r>
-              <w:rPr>
-                <w:rFonts w:ascii="Times New Roman" w:hAnsi="Times New Roman"/>
-                <w:b w:val="0"/>
-                <w:i w:val="0"/>
-                <w:color w:val="000000"/>
-                <w:sz w:val="20"/>
-              </w:rPr>
-              <w:t xml:space="preserve">laporan </w:t>
+              <w:t xml:space="preserve">denda </w:t>
             </w:r>
             <w:r>
               <w:rPr>
@@ -3656,6 +4505,16 @@
                 <w:sz w:val="20"/>
               </w:rPr>
               <w:t xml:space="preserve">tetap </w:t>
+            </w:r>
+            <w:r>
+              <w:rPr>
+                <w:rFonts w:ascii="Times New Roman" w:hAnsi="Times New Roman"/>
+                <w:b w:val="0"/>
+                <w:i w:val="0"/>
+                <w:color w:val="000000"/>
+                <w:sz w:val="20"/>
+              </w:rPr>
+              <w:t xml:space="preserve">berada </w:t>
             </w:r>
             <w:r>
               <w:rPr>
@@ -3713,7 +4572,7 @@
           <w:color w:val="333333"/>
           <w:sz w:val="19"/>
         </w:rPr>
-        <w:t>Tabel 2. Matriks pemenuhan pilar Responsible AI pada Genesis.</w:t>
+        <w:t>Tabel 4. Matriks kepatuhan terhadap pilar Responsible AI pada platform Genesis.</w:t>
       </w:r>
     </w:p>
     <w:p>
@@ -3734,12 +4593,29 @@
           <w:color w:val="000000"/>
           <w:sz w:val="24"/>
         </w:rPr>
-        <w:t>8.1 Rencana Pengujian, Skalabilitas, &amp; Verifikasi Kode</w:t>
+        <w:t>X. RENCANA PENGUJIAN, SKALABILITAS, &amp; VERIFIKASI</w:t>
       </w:r>
     </w:p>
     <w:p>
       <w:pPr>
-        <w:spacing w:before="0" w:after="80" w:line="360" w:lineRule="auto"/>
+        <w:spacing w:before="0" w:after="120" w:line="360" w:lineRule="auto"/>
+        <w:ind w:firstLine="720"/>
+        <w:jc w:val="both"/>
+      </w:pPr>
+      <w:r>
+        <w:rPr>
+          <w:rFonts w:ascii="Times New Roman" w:hAnsi="Times New Roman"/>
+          <w:b w:val="0"/>
+          <w:i w:val="0"/>
+          <w:color w:val="000000"/>
+          <w:sz w:val="24"/>
+        </w:rPr>
+        <w:t>Untuk menjamin keandalan operasional platform Genesis saat melayani skala perkotaan maupun nasional, tim pengembang menerapkan serangkaian prosedur pengujian kualitas kode secara komprehensif. Pengujian dipecah ke dalam tiga tahap pengujian utama: (1) Pengujian statis kualitas penulisan kode (static analysis), (2) Pengujian unit fungsionalitas logika bisnis (unit testing), dan (3) Simulasi beban dinamis (load testing).</w:t>
+      </w:r>
+    </w:p>
+    <w:p>
+      <w:pPr>
+        <w:spacing w:before="0" w:after="120" w:line="360" w:lineRule="auto"/>
         <w:ind w:firstLine="720"/>
         <w:jc w:val="both"/>
       </w:pPr>
@@ -3751,12 +4627,12 @@
           <w:color w:val="000000"/>
           <w:sz w:val="24"/>
         </w:rPr>
-        <w:t>Untuk menjamin keandalan platform Genesis saat dioperasikan secara massal pada tingkat kota maupun nasional, tim pengembang menerapkan standar pengujian kualitas kode yang sangat ketat. Kode pemrograman diuji secara statis menggunakan perintah analisis linting bawaan dari masing-masing bahasa pemograman (seperti `flutter analyze` pada sisi mobile client, serta aturan linting ESLint pada NestJS backend) untuk memastikan tidak ada kesalahan penulisan tipe data atau potensi kebocoran memori.</w:t>
+        <w:t>Pengujian statis dijalankan menggunakan tool bawaan masing-masing framework. Pada sisi Flutter mobile client, perintah `flutter analyze` dieksekusi secara ketat untuk mematikan tidak ada peringatan kode mati (dead code) atau kebocoran memori pada widget scroll controller. Pada sisi NestJS backend, standarisasi kode diperiksa menggunakan ESLint dan TypeScript compiler untuk mencegah terjadinya bug tipe data saat runtime.</w:t>
       </w:r>
     </w:p>
     <w:p>
       <w:pPr>
-        <w:spacing w:before="0" w:after="80" w:line="360" w:lineRule="auto"/>
+        <w:spacing w:before="0" w:after="120" w:line="360" w:lineRule="auto"/>
         <w:ind w:firstLine="720"/>
         <w:jc w:val="both"/>
       </w:pPr>
@@ -3764,11 +4640,11 @@
         <w:rPr>
           <w:rFonts w:ascii="Times New Roman" w:hAnsi="Times New Roman"/>
           <w:b w:val="0"/>
-          <w:i w:val="0"/>
+          <w:i/>
           <w:color w:val="000000"/>
           <w:sz w:val="24"/>
         </w:rPr>
-        <w:t>Verifikasi performa dilakukan secara berkala melalui simulasi uji beban (load testing) menggunakan pustaka pengujian otomatis untuk melacak waktu respons server dan latensi aliran data SSE saat melayani ribuan kueri bersamaan. Seluruh uji kompilasi APK rilis untuk masing-masing ABI target dijalankan secara otomatis lewat integrasi pipa CI/CD, menghasilkan berkas siap pasang dengan ukuran biner yang sangat efisien dan bebas dari kerentanan keamanan pihak ketiga.</w:t>
+        <w:t>Pengujian unit logika dilakukan menggunakan kerangka kerja Jest pada NestJS untuk memverifikasi keakuratan algoritma deduplikasi spasial PostGIS dan ketepatan perhitungan XP gamifikasi. Simulasi uji beban dijalankan untuk memantau performa respon server saat menerima lonjakan ribuan request stream SSE secara simultan. Uji kompilasi mandiri untuk target rilis android (`--split-per-abi`) dilakukan guna melahirkan bundel APK teringkas yang bebas dari celah keamanan pustaka pihak ketiga.</w:t>
       </w:r>
     </w:p>
     <w:p>
@@ -3789,14 +4665,8 @@
           <w:color w:val="000000"/>
           <w:sz w:val="24"/>
         </w:rPr>
-        <w:t>IX. Daftar Pustaka</w:t>
+        <w:t>XI. DAFTAR PUSTAKA (APA 7TH EDITION)</w:t>
       </w:r>
-    </w:p>
-    <w:p>
-      <w:pPr>
-        <w:spacing w:before="120" w:after="160" w:line="360" w:lineRule="auto"/>
-        <w:jc w:val="both"/>
-      </w:pPr>
     </w:p>
     <w:p>
       <w:pPr>

</xml_diff>